<commit_message>
Update Day 03 lab guide and slides
Replace Day_03_Lab_Guide.docx and Day_03_Slides.pptx in Week_01/Day_03 with updated binary versions. These updates refresh the Day 03 lab guide and presentation materials (content changes are contained within the binary files).
</commit_message>
<xml_diff>
--- a/Week_01/Day_03/Lab/Day_03_Lab_Guide.docx
+++ b/Week_01/Day_03/Lab/Day_03_Lab_Guide.docx
@@ -1,60 +1,23 @@
 
 <file path=word/document.xml><?xml version="1.0" encoding="utf-8"?>
-<w:document xmlns:ns1="http://schemas.openxmlformats.org/markup-compatibility/2006" xmlns:w="http://schemas.openxmlformats.org/wordprocessingml/2006/main" ns1:Ignorable="w14 wp14">
+<w:document xmlns:wpc="http://schemas.microsoft.com/office/word/2010/wordprocessingCanvas" xmlns:mo="http://schemas.microsoft.com/office/mac/office/2008/main" xmlns:mc="http://schemas.openxmlformats.org/markup-compatibility/2006" xmlns:mv="urn:schemas-microsoft-com:mac:vml" xmlns:o="urn:schemas-microsoft-com:office:office" xmlns:r="http://schemas.openxmlformats.org/officeDocument/2006/relationships" xmlns:m="http://schemas.openxmlformats.org/officeDocument/2006/math" xmlns:v="urn:schemas-microsoft-com:vml" xmlns:wp14="http://schemas.microsoft.com/office/word/2010/wordprocessingDrawing" xmlns:wp="http://schemas.openxmlformats.org/drawingml/2006/wordprocessingDrawing" xmlns:w10="urn:schemas-microsoft-com:office:word" xmlns:w="http://schemas.openxmlformats.org/wordprocessingml/2006/main" xmlns:w14="http://schemas.microsoft.com/office/word/2010/wordml" xmlns:wpg="http://schemas.microsoft.com/office/word/2010/wordprocessingGroup" xmlns:wpi="http://schemas.microsoft.com/office/word/2010/wordprocessingInk" xmlns:wne="http://schemas.microsoft.com/office/word/2006/wordml" xmlns:wps="http://schemas.microsoft.com/office/word/2010/wordprocessingShape" mc:Ignorable="w14 wp14">
   <w:body>
     <w:p>
-      <w:r>
-        <w:br w:type="page"/>
-      </w:r>
-    </w:p>
-    <w:p>
-      <w:pPr>
-        <w:jc w:val="center"/>
-      </w:pPr>
       <w:r>
         <w:rPr>
           <w:b/>
-          <w:sz w:val="56"/>
         </w:rPr>
-        <w:t>Data Engineering Workshop</w:t>
-      </w:r>
-      <w:r>
-        <w:rPr>
-          <w:b/>
-          <w:sz w:val="44"/>
-        </w:rPr>
-        <w:br/>
-        <w:t>Day 3 Lab Manual</w:t>
-      </w:r>
-      <w:r>
-        <w:rPr>
-          <w:sz w:val="32"/>
-        </w:rPr>
-        <w:br/>
-        <w:t>Advanced Kafka Concepts &amp; Tools</w:t>
-      </w:r>
-      <w:r>
-        <w:rPr>
-          <w:i/>
-          <w:sz w:val="24"/>
-        </w:rPr>
-        <w:br/>
-        <w:br/>
-        <w:t>May 2026</w:t>
-      </w:r>
-      <w:r>
-        <w:rPr>
-          <w:i/>
-          <w:sz w:val="20"/>
-        </w:rPr>
-        <w:br/>
-        <w:br/>
-        <w:t>Hands‑on exercises exploring consumer groups, offsets, replication and Connect</w:t>
-      </w:r>
-    </w:p>
-    <w:p>
-      <w:r>
-        <w:br w:type="page"/>
+        <w:t>Day 3 Lab Guide: Kafka Advanced Concepts, Connect, and Kafka UI</w:t>
+      </w:r>
+    </w:p>
+    <w:p>
+      <w:r>
+        <w:t>Consumer groups, offsets, lag, replication, ISR, Kafka Connect, and Kafka UI evidence.</w:t>
+      </w:r>
+    </w:p>
+    <w:p>
+      <w:r>
+        <w:t>Each exercise explains what the command does, what to observe, and why it matters.</w:t>
       </w:r>
     </w:p>
     <w:p>
@@ -62,67 +25,81 @@
         <w:pStyle w:val="Heading1"/>
       </w:pPr>
       <w:r>
-        <w:t>Table of Contents</w:t>
-      </w:r>
-    </w:p>
-    <w:p>
-      <w:r>
-        <w:rPr>
-          <w:i/>
-        </w:rPr>
-        <w:br/>
-        <w:t>Note: After opening this document in Microsoft Word, right‑click on the table of contents field and select 'Update Field' to populate the page numbers.</w:t>
+        <w:t>Lab Overview</w:t>
+      </w:r>
+    </w:p>
+    <w:p>
+      <w:pPr>
+        <w:pStyle w:val="ListBullet"/>
+      </w:pPr>
+      <w:r>
+        <w:t>This guide follows the same pattern as Day 2: Goal, What you learn, commands, Explanation, Mini-check, Solution, and Evidence to capture.</w:t>
+      </w:r>
+    </w:p>
+    <w:p>
+      <w:pPr>
+        <w:pStyle w:val="ListBullet"/>
+      </w:pPr>
+      <w:r>
+        <w:t>Day 2 already covered Kafka as an event bus, the single-broker Docker stack, topic creation, console producer and consumer basics, Python producer and consumer basics, and Kafka UI basics.</w:t>
+      </w:r>
+    </w:p>
+    <w:p>
+      <w:pPr>
+        <w:pStyle w:val="ListBullet"/>
+      </w:pPr>
+      <w:r>
+        <w:t>Day 3 does not repeat those fundamentals in depth. It extends them into consumer groups, offsets, lag, replication, ISR, KRaft, Kafka Connect, and operational evidence.</w:t>
+      </w:r>
+    </w:p>
+    <w:p>
+      <w:pPr>
+        <w:pStyle w:val="ListBullet"/>
+      </w:pPr>
+      <w:r>
+        <w:t>Commands avoid shell-specific PowerShell syntax. Windows learners can use Command Prompt; macOS and Linux learners can use Bash.</w:t>
       </w:r>
     </w:p>
     <w:p>
       <w:pPr>
         <w:pStyle w:val="Heading1"/>
-        <w:jc w:val="left"/>
       </w:pPr>
       <w:r>
-        <w:t>1  Lab Overview</w:t>
-      </w:r>
-    </w:p>
-    <w:p>
-      <w:pPr>
-        <w:pStyle w:val="BodyText"/>
-      </w:pPr>
-      <w:r>
-        <w:rPr>
-          <w:b w:val="0"/>
-        </w:rPr>
-        <w:t>Day 3 builds on your understanding of Kafka by diving into advanced topics: consumer groups, offset management, replication and fault tolerance, and the Kafka Connect framework. In this lab you will spin up a single‑node Kafka cluster with a Connect worker, experiment with consumer groups, manage offsets manually, explore replication settings, and deploy source and sink connectors.</w:t>
-      </w:r>
-    </w:p>
-    <w:p>
-      <w:pPr>
-        <w:pStyle w:val="BodyText"/>
-      </w:pPr>
-      <w:r>
-        <w:rPr>
-          <w:b w:val="0"/>
-        </w:rPr>
-        <w:t>The exercises are structured to mirror the lecture topics.  Each section includes detailed steps, hands‑on tasks and mini challenges to consolidate your learning.  At the end you'll find multiple‑choice questions and answers to test your understanding.</w:t>
-      </w:r>
-    </w:p>
-    <w:p>
-      <w:pPr>
-        <w:pStyle w:val="Heading1"/>
-        <w:jc w:val="left"/>
-      </w:pPr>
-      <w:r>
-        <w:t>2  Prerequisites</w:t>
-      </w:r>
-    </w:p>
-    <w:p>
-      <w:pPr>
-        <w:pStyle w:val="BodyText"/>
-      </w:pPr>
+        <w:t>Working Folder</w:t>
+      </w:r>
+    </w:p>
+    <w:p>
       <w:r>
         <w:rPr>
           <w:b/>
         </w:rPr>
-        <w:t>Ensure your workstation meets the following requirements before beginning the lab:</w:t>
+        <w:t>Windows Command Prompt</w:t>
+      </w:r>
+    </w:p>
+    <w:p>
+      <w:r>
+        <w:t>cd Week_01\Day_03\Lab_Files_Client_Ready</w:t>
+      </w:r>
+    </w:p>
+    <w:p>
+      <w:r>
+        <w:rPr>
+          <w:b/>
+        </w:rPr>
+        <w:t>macOS / Linux Bash</w:t>
+      </w:r>
+    </w:p>
+    <w:p>
+      <w:r>
+        <w:t>cd Week_01/Day_03/Lab_Files_Client_Ready</w:t>
+      </w:r>
+    </w:p>
+    <w:p>
+      <w:pPr>
+        <w:pStyle w:val="Heading1"/>
+      </w:pPr>
+      <w:r>
+        <w:t>Prerequisites</w:t>
       </w:r>
     </w:p>
     <w:p>
@@ -130,7 +107,7 @@
         <w:pStyle w:val="ListBullet"/>
       </w:pPr>
       <w:r>
-        <w:t>Ubuntu 24.04 LTS (recommended) or CentOS 9.  Windows 10/11 users should install WSL2 with Ubuntu.</w:t>
+        <w:t>Docker Desktop or Docker Engine with Docker Compose v2.</w:t>
       </w:r>
     </w:p>
     <w:p>
@@ -138,7 +115,7 @@
         <w:pStyle w:val="ListBullet"/>
       </w:pPr>
       <w:r>
-        <w:t>Docker Engine and Docker Compose plugin installed.  Use the provided install scripts in the install‑scripts folder.</w:t>
+        <w:t>Python 3.10 or newer.</w:t>
       </w:r>
     </w:p>
     <w:p>
@@ -146,377 +123,1969 @@
         <w:pStyle w:val="ListBullet"/>
       </w:pPr>
       <w:r>
-        <w:t>Python 3.10 or higher with pip and Git installed.(Used for optional producer/consumer scripts).</w:t>
+        <w:t>curl available in the terminal. It is included on modern Windows, macOS, and most Linux distributions.</w:t>
       </w:r>
     </w:p>
     <w:p>
       <w:pPr>
-        <w:pStyle w:val="BodyText"/>
+        <w:pStyle w:val="ListBullet"/>
       </w:pPr>
       <w:r>
-        <w:rPr>
-          <w:b w:val="0"/>
-        </w:rPr>
-        <w:t>To prepare your environment, run the `install_day3_linux.sh` script on Ubuntu or `install_day3_windows.ps1` on Windows (as Administrator).  These scripts install Docker, Python and Git.</w:t>
+        <w:t>Ports 8080, 8083, 9092, 9093, and 9094 must be free before starting Day 3.</w:t>
       </w:r>
     </w:p>
     <w:p>
       <w:pPr>
         <w:pStyle w:val="Heading1"/>
-        <w:jc w:val="left"/>
       </w:pPr>
       <w:r>
-        <w:t>3  Environment Setup</w:t>
+        <w:t>Confluent Image Version Note</w:t>
       </w:r>
     </w:p>
     <w:p>
       <w:pPr>
-        <w:pStyle w:val="BodyText"/>
+        <w:pStyle w:val="ListBullet"/>
       </w:pPr>
+      <w:r>
+        <w:t>The lab currently uses `confluentinc/cp-kafka:7.4.0` for both broker and Connect containers.</w:t>
+      </w:r>
+    </w:p>
+    <w:p>
+      <w:pPr>
+        <w:pStyle w:val="ListBullet"/>
+      </w:pPr>
+      <w:r>
+        <w:t>This was changed only because the local lab machine already had 7.4.0 cached and could not reliably pull the larger 7.5.0 images during validation.</w:t>
+      </w:r>
+    </w:p>
+    <w:p>
+      <w:pPr>
+        <w:pStyle w:val="ListBullet"/>
+      </w:pPr>
+      <w:r>
+        <w:t>The Day 3 concepts do not depend on that minor version difference: consumer groups, offsets, replication, ISR, KRaft and FileStream Connect are all available for this lab.</w:t>
+      </w:r>
+    </w:p>
+    <w:p>
+      <w:pPr>
+        <w:pStyle w:val="ListBullet"/>
+      </w:pPr>
+      <w:r>
+        <w:t>If a classroom environment can pre-pull images, the same lab can be moved back to matching 7.5.x broker and Connect images.</w:t>
+      </w:r>
+    </w:p>
+    <w:p>
+      <w:pPr>
+        <w:pStyle w:val="Heading1"/>
+      </w:pPr>
+      <w:r>
+        <w:t>Theory-to-Lab Coverage Map</w:t>
+      </w:r>
+    </w:p>
+    <w:p>
+      <w:pPr>
+        <w:pStyle w:val="ListBullet"/>
+      </w:pPr>
+      <w:r>
+        <w:t>Consumer groups, partition assignment and rebalancing: Exercises 6, 7 and 8.</w:t>
+      </w:r>
+    </w:p>
+    <w:p>
+      <w:pPr>
+        <w:pStyle w:val="ListBullet"/>
+      </w:pPr>
+      <w:r>
+        <w:t>Offsets, manual commits, lag and replay: Exercises 7 and 9.</w:t>
+      </w:r>
+    </w:p>
+    <w:p>
+      <w:pPr>
+        <w:pStyle w:val="ListBullet"/>
+      </w:pPr>
+      <w:r>
+        <w:t>Producer durability and delivery semantics: Exercises 5 and 6.</w:t>
+      </w:r>
+    </w:p>
+    <w:p>
+      <w:pPr>
+        <w:pStyle w:val="ListBullet"/>
+      </w:pPr>
+      <w:r>
+        <w:t>Replication, ISR, broker failure and KRaft recovery: Exercises 4 and 5.</w:t>
+      </w:r>
+    </w:p>
+    <w:p>
+      <w:pPr>
+        <w:pStyle w:val="ListBullet"/>
+      </w:pPr>
+      <w:r>
+        <w:t>Kafka Connect source/sink direction, task status, recovery and troubleshooting: Exercises 11, 12 and 13.</w:t>
+      </w:r>
+    </w:p>
+    <w:p>
+      <w:pPr>
+        <w:pStyle w:val="ListBullet"/>
+      </w:pPr>
+      <w:r>
+        <w:t>Kafka UI evidence and ecosystem tool choice: Exercises 3 and 14.</w:t>
+      </w:r>
+    </w:p>
+    <w:p>
+      <w:pPr>
+        <w:pStyle w:val="Heading1"/>
+      </w:pPr>
+      <w:r>
+        <w:t>Exercise 1: Verify the Lab Machine</w:t>
+      </w:r>
+    </w:p>
+    <w:p>
       <w:r>
         <w:rPr>
           <w:b/>
         </w:rPr>
-        <w:t>Follow these steps to launch your lab environment:</w:t>
-      </w:r>
-    </w:p>
-    <w:p>
-      <w:r>
-        <w:t>Open a terminal and navigate to `Week_01/Day_03/Lab_Files` in this course package.</w:t>
-      </w:r>
-    </w:p>
-    <w:p>
-      <w:r>
-        <w:t>Run `sudo docker compose up -d` to start the Kafka broker and Connect worker. Docker will pull the necessary images on first run. If your user is already in the Docker group, `docker compose up -d` is enough.</w:t>
-      </w:r>
-    </w:p>
-    <w:p>
-      <w:r>
-        <w:t>Correction for the supplied Compose environment: the KRaft broker needs `CLUSTER_ID`, and the lab uses an internal Kafka listener `broker:29092` plus host listener `localhost:9092`. The supplied Lab_Files/docker-compose.yml has been updated accordingly.</w:t>
-      </w:r>
-    </w:p>
-    <w:p>
-      <w:pPr>
-        <w:pStyle w:val="ListNumber"/>
-      </w:pPr>
-      <w:r>
-        <w:t>Wait a few moments for the services to initialise.  You can check container logs using `docker compose logs -f broker` and `docker compose logs -f connect`.</w:t>
-      </w:r>
-    </w:p>
-    <w:p>
-      <w:r>
-        <w:t>Correction for Kafka Connect: recent Confluent images may not expose FileStream connectors unless the FileStream artifact is present in the Connect plugin path. This lab package now mounts `plugins/filestream/connect-file-3.5.0.jar` into `/usr/share/filestream-connectors`.</w:t>
-      </w:r>
-    </w:p>
-    <w:p>
-      <w:r>
-        <w:t>Once the containers are healthy, verify that Kafka is reachable by running `sudo docker compose exec broker kafka-topics --bootstrap-server broker:29092 --list`. In this image the Kafka command names do not use the `.sh` suffix.</w:t>
-      </w:r>
-    </w:p>
-    <w:p>
-      <w:pPr>
-        <w:pStyle w:val="BodyText"/>
-      </w:pPr>
-      <w:r>
-        <w:rPr>
-          <w:b w:val="0"/>
-        </w:rPr>
-        <w:t>Your environment is now ready for the exercises.</w:t>
-      </w:r>
-    </w:p>
-    <w:p>
-      <w:pPr>
-        <w:pStyle w:val="Heading1"/>
-        <w:jc w:val="left"/>
-      </w:pPr>
-      <w:r>
-        <w:t>4  Exercise 1: Exploring Consumer Groups</w:t>
-      </w:r>
-    </w:p>
-    <w:p>
-      <w:pPr>
-        <w:pStyle w:val="BodyText"/>
-      </w:pPr>
-      <w:r>
-        <w:rPr>
-          <w:b w:val="0"/>
-        </w:rPr>
-        <w:t>In this exercise you'll see how Kafka distributes partitions across consumers in the same group and how rebalancing works when members join or leave.</w:t>
-      </w:r>
-    </w:p>
-    <w:p>
-      <w:r>
-        <w:t>Create a topic named `logs` with 3 partitions: `sudo docker compose exec broker kafka-topics --bootstrap-server broker:29092 --create --topic logs --partitions 3 --replication-factor 1`.</w:t>
-      </w:r>
-    </w:p>
-    <w:p>
-      <w:r>
-        <w:t>Produce some messages into the topic: open a new terminal and run `sudo docker compose exec broker kafka-console-producer --bootstrap-server broker:29092 --topic logs` and type a few lines of text. Press Ctrl+C when done.</w:t>
-      </w:r>
-    </w:p>
-    <w:p>
-      <w:r>
-        <w:t>Start the first consumer in group `cg1`: `sudo docker compose exec broker kafka-console-consumer --bootstrap-server broker:29092 --topic logs --group cg1 --property print.partition=true`. Observe which partitions the consumer reads from.</w:t>
-      </w:r>
-    </w:p>
-    <w:p>
-      <w:pPr>
-        <w:pStyle w:val="ListNumber"/>
-      </w:pPr>
-      <w:r>
-        <w:t>Start a second consumer in the same group (open another terminal).  Notice that partitions are now split between them.</w:t>
-      </w:r>
-    </w:p>
-    <w:p>
-      <w:pPr>
-        <w:pStyle w:val="ListNumber"/>
-      </w:pPr>
-      <w:r>
-        <w:t>Start a third consumer and watch how rebalancing occurs.  Which assignment strategy is the default? (Hint: cooperative sticky).</w:t>
-      </w:r>
-    </w:p>
-    <w:p>
-      <w:pPr>
-        <w:pStyle w:val="ListNumber"/>
-      </w:pPr>
-      <w:r>
-        <w:t>Stop one of the consumers (Ctrl+C) and observe how partitions are reassigned.</w:t>
-      </w:r>
-    </w:p>
-    <w:p>
-      <w:pPr>
-        <w:pStyle w:val="BodyText"/>
-      </w:pPr>
+        <w:t xml:space="preserve">Goal: </w:t>
+      </w:r>
+      <w:r>
+        <w:t>Confirm the tools needed for Day 3 are available.</w:t>
+      </w:r>
+    </w:p>
+    <w:p>
       <w:r>
         <w:rPr>
           <w:b/>
         </w:rPr>
-        <w:t>Mini challenge: With 3 partitions and 2 consumers, how many partitions does each consumer get?  What happens when you add a third consumer?</w:t>
-      </w:r>
-    </w:p>
-    <w:p>
-      <w:pPr>
-        <w:pStyle w:val="Heading1"/>
-        <w:jc w:val="left"/>
-      </w:pPr>
-      <w:r>
-        <w:t>5  Exercise 2: Managing Offsets</w:t>
-      </w:r>
-    </w:p>
-    <w:p>
-      <w:pPr>
-        <w:pStyle w:val="BodyText"/>
-      </w:pPr>
-      <w:r>
-        <w:rPr>
-          <w:b w:val="0"/>
-        </w:rPr>
-        <w:t>Offsets track your consumer’s position in a partition.  You'll practise manual commits and resetting offsets.</w:t>
-      </w:r>
-    </w:p>
-    <w:p>
-      <w:r>
-        <w:t>Launch a new consumer with auto-commit disabled: `sudo docker compose exec broker kafka-console-consumer --bootstrap-server broker:29092 --topic logs --group cg2 --from-beginning --consumer-property enable.auto.commit=false`. The `--from-beginning` flag ensures it reads from offset 0.</w:t>
-      </w:r>
-    </w:p>
-    <w:p>
-      <w:pPr>
-        <w:pStyle w:val="ListNumber"/>
-      </w:pPr>
-      <w:r>
-        <w:t>After consuming a few messages, press Ctrl+C.  Note that offsets are not committed yet because auto‑commit was disabled.</w:t>
-      </w:r>
-    </w:p>
-    <w:p>
-      <w:r>
-        <w:t>View the group offsets: `sudo docker compose exec broker kafka-consumer-groups --bootstrap-server broker:29092 --describe --group cg2`. You should see `CURRENT-OFFSET` and `LOG-END-OFFSET` values.</w:t>
-      </w:r>
-    </w:p>
-    <w:p>
-      <w:r>
-        <w:t>Reset offsets back to the earliest position: `sudo docker compose exec broker kafka-consumer-groups --bootstrap-server broker:29092 --group cg2 --topic logs --reset-offsets --to-earliest --execute`. Then consume again with `--from-beginning` and verify that you receive the same messages a second time.</w:t>
-      </w:r>
-    </w:p>
-    <w:p>
-      <w:r>
-        <w:t>Install the Python client if needed with `python3 -m pip install --user confluent-kafka`, then try committing offsets manually by running `python3 consumer.py`. Notice how manual commits give you control over when offsets advance.</w:t>
-      </w:r>
-    </w:p>
-    <w:p>
-      <w:pPr>
-        <w:pStyle w:val="BodyText"/>
-      </w:pPr>
+        <w:t xml:space="preserve">What you learn: </w:t>
+      </w:r>
+      <w:r>
+        <w:t>Day 2 already verified the basic Docker and Python workflow. Day 3 adds Kafka Connect REST calls, so `curl` is also checked here.</w:t>
+      </w:r>
+    </w:p>
+    <w:p>
       <w:r>
         <w:rPr>
           <w:b/>
         </w:rPr>
-        <w:t>Mini challenge: Explain the difference between at‑most‑once, at‑least‑once and exactly‑once delivery.  Which configurations influence these semantics?</w:t>
-      </w:r>
-    </w:p>
-    <w:p>
-      <w:pPr>
-        <w:pStyle w:val="Heading1"/>
-        <w:jc w:val="left"/>
-      </w:pPr>
-      <w:r>
-        <w:t>6  Exercise 3: Replication &amp; Fault Tolerance</w:t>
-      </w:r>
-    </w:p>
-    <w:p>
-      <w:pPr>
-        <w:pStyle w:val="BodyText"/>
-      </w:pPr>
-      <w:r>
-        <w:rPr>
-          <w:b w:val="0"/>
-        </w:rPr>
-        <w:t>Kafka stores replicas of your data to survive broker failures.  Here we'll examine replication settings and discuss failure scenarios.</w:t>
-      </w:r>
-    </w:p>
-    <w:p>
-      <w:r>
-        <w:t>Create a topic `orders` with 2 partitions and a replication factor of 1: `sudo docker compose exec broker kafka-topics --bootstrap-server broker:29092 --create --topic orders --partitions 2 --replication-factor 1`. With a single broker this is the maximum replication factor.</w:t>
-      </w:r>
-    </w:p>
-    <w:p>
-      <w:r>
-        <w:t>Produce some sample orders: `sudo docker compose exec broker kafka-console-producer --bootstrap-server broker:29092 --topic orders`. Enter a few lines.</w:t>
-      </w:r>
-    </w:p>
-    <w:p>
-      <w:r>
-        <w:t>Configure a producer to require acknowledgement from all replicas: in `producer.py` set `acks='all'` and run it with `python3 producer.py orders`. Observe that the producer still succeeds because there is only one replica.</w:t>
-      </w:r>
-    </w:p>
-    <w:p>
-      <w:pPr>
-        <w:pStyle w:val="ListNumber"/>
-      </w:pPr>
-      <w:r>
-        <w:t>Discuss: If your cluster had 3 brokers and `replication-factor=3` with `min.insync.replicas=2`, how many brokers could fail without losing the ability to write?</w:t>
-      </w:r>
-    </w:p>
-    <w:p>
-      <w:pPr>
-        <w:pStyle w:val="BodyText"/>
-      </w:pPr>
+        <w:t>Windows Command Prompt</w:t>
+      </w:r>
+    </w:p>
+    <w:p>
+      <w:r>
+        <w:t>docker --version</w:t>
+      </w:r>
+    </w:p>
+    <w:p>
+      <w:r>
+        <w:t>docker compose version</w:t>
+      </w:r>
+    </w:p>
+    <w:p>
+      <w:r>
+        <w:t>python --version</w:t>
+      </w:r>
+    </w:p>
+    <w:p>
+      <w:r>
+        <w:t>curl --version</w:t>
+      </w:r>
+    </w:p>
+    <w:p>
       <w:r>
         <w:rPr>
           <w:b/>
         </w:rPr>
-        <w:t>Mini challenge: What happens when a leader broker fails?  How does Kafka elect a new leader?  Why is rack awareness important?</w:t>
-      </w:r>
-    </w:p>
-    <w:p>
-      <w:pPr>
-        <w:pStyle w:val="Heading1"/>
-        <w:jc w:val="left"/>
-      </w:pPr>
-      <w:r>
-        <w:t>7  Exercise 4: Deploying Kafka Connect</w:t>
-      </w:r>
-    </w:p>
-    <w:p>
-      <w:pPr>
-        <w:pStyle w:val="BodyText"/>
-      </w:pPr>
-      <w:r>
-        <w:rPr>
-          <w:b w:val="0"/>
-        </w:rPr>
-        <w:t>You will now deploy a simple source connector to ingest data from a file into a Kafka topic.  We'll use the built‑in FileStreamSourceConnector and FileStreamSinkConnector provided with the Confluent Kafka Connect image.</w:t>
-      </w:r>
-    </w:p>
-    <w:p>
-      <w:r>
-        <w:t>Create an input directory on the host: `mkdir -p data/input data/output`. If Docker created `data/` as root-owned, first run `sudo chown -R $USER:$USER data`.</w:t>
-      </w:r>
-    </w:p>
-    <w:p>
-      <w:r>
-        <w:t>Create a sample file with one record per line: `printf 'apple\nbanana\ncarrot\n' &gt; data/input/produce.txt`. Each line will be streamed as a message.</w:t>
-      </w:r>
-    </w:p>
-    <w:p>
-      <w:r>
-        <w:t>Register the FileStreamSourceConnector via the Connect REST API: `curl -X POST http://localhost:8083/connectors -H 'Content-Type: application/json' -d @connector-source.json`. This configuration ingests from `/data/input/produce.txt` into topic `fs-source`.</w:t>
-      </w:r>
-    </w:p>
-    <w:p>
-      <w:r>
-        <w:t>Use `sudo docker compose exec broker kafka-console-consumer --bootstrap-server broker:29092 --topic fs-source --from-beginning --group fs-group` to verify that the file contents have been streamed.</w:t>
-      </w:r>
-    </w:p>
-    <w:p>
-      <w:r>
-        <w:t>Deploy a FileStreamSinkConnector to write from `fs-source` into a new file. Post the configuration file `connector-sink.json` similarly: `curl -X POST http://localhost:8083/connectors -H 'Content-Type: application/json' -d @connector-sink.json`. Check that `data/output/consume.txt` contains the messages after a few seconds.</w:t>
-      </w:r>
-    </w:p>
-    <w:p>
-      <w:pPr>
-        <w:pStyle w:val="ListNumber"/>
-      </w:pPr>
-      <w:r>
-        <w:t>Modify the source connector’s polling interval from 1000 ms to 5000 ms and verify that the ingestion frequency changes.  Use the Connect REST API to `PUT` an updated configuration.</w:t>
-      </w:r>
-    </w:p>
-    <w:p>
-      <w:pPr>
-        <w:pStyle w:val="BodyText"/>
-      </w:pPr>
+        <w:t>macOS / Linux Bash</w:t>
+      </w:r>
+    </w:p>
+    <w:p>
+      <w:r>
+        <w:t>docker --version</w:t>
+      </w:r>
+    </w:p>
+    <w:p>
+      <w:r>
+        <w:t>docker compose version</w:t>
+      </w:r>
+    </w:p>
+    <w:p>
+      <w:r>
+        <w:t>python3 --version</w:t>
+      </w:r>
+    </w:p>
+    <w:p>
+      <w:r>
+        <w:t>curl --version</w:t>
+      </w:r>
+    </w:p>
+    <w:p>
       <w:r>
         <w:rPr>
           <w:b/>
         </w:rPr>
-        <w:t>Mini challenge: Which component of Kafka Connect performs the actual data movement?  How does scaling the number of tasks affect throughput?</w:t>
+        <w:t xml:space="preserve">Explanation: </w:t>
+      </w:r>
+      <w:r>
+        <w:t>Do this check first so later errors are not mistaken for Kafka errors. If Docker commands fail, start Docker Desktop or Docker Engine and wait until it is ready.</w:t>
+      </w:r>
+    </w:p>
+    <w:p>
+      <w:r>
+        <w:rPr>
+          <w:b/>
+        </w:rPr>
+        <w:t xml:space="preserve">Mini-check: </w:t>
+      </w:r>
+      <w:r>
+        <w:t>Which new command is added for Day 3 compared with Day 2?</w:t>
+      </w:r>
+    </w:p>
+    <w:p>
+      <w:r>
+        <w:rPr>
+          <w:b/>
+        </w:rPr>
+        <w:t xml:space="preserve">Solution: </w:t>
+      </w:r>
+      <w:r>
+        <w:t>`curl --version`, because Day 3 uses Kafka Connect REST endpoints.</w:t>
+      </w:r>
+    </w:p>
+    <w:p>
+      <w:r>
+        <w:rPr>
+          <w:b/>
+        </w:rPr>
+        <w:t xml:space="preserve">Evidence to capture: </w:t>
+      </w:r>
+      <w:r>
+        <w:t>Docker, Compose, Python, and curl version output.</w:t>
       </w:r>
     </w:p>
     <w:p>
       <w:pPr>
         <w:pStyle w:val="Heading1"/>
-        <w:jc w:val="left"/>
       </w:pPr>
       <w:r>
-        <w:t>8  Exercise 5: Optional — Exploring Sink Connectors</w:t>
-      </w:r>
-    </w:p>
-    <w:p>
-      <w:pPr>
-        <w:pStyle w:val="BodyText"/>
-      </w:pPr>
+        <w:t>Exercise 2: Start Kafka, Kafka Connect, and Kafka UI</w:t>
+      </w:r>
+    </w:p>
+    <w:p>
       <w:r>
         <w:rPr>
-          <w:b w:val="0"/>
+          <w:b/>
         </w:rPr>
-        <w:t>This optional exercise invites you to try a database or search engine sink connector (e.g., JDBC or Elasticsearch) if you have a target system available.  The steps are similar: configure the connector with connection details, choose an idempotent insert/update mode and verify that records are written.</w:t>
+        <w:t xml:space="preserve">Goal: </w:t>
+      </w:r>
+      <w:r>
+        <w:t>Start the Day 3 production-like local Kafka stack.</w:t>
+      </w:r>
+    </w:p>
+    <w:p>
+      <w:r>
+        <w:rPr>
+          <w:b/>
+        </w:rPr>
+        <w:t xml:space="preserve">What you learn: </w:t>
+      </w:r>
+      <w:r>
+        <w:t>Day 2 used one broker. Day 3 uses three brokers, Kafka Connect, and Kafka UI.</w:t>
+      </w:r>
+    </w:p>
+    <w:p>
+      <w:r>
+        <w:rPr>
+          <w:b/>
+        </w:rPr>
+        <w:t>Windows Command Prompt</w:t>
+      </w:r>
+    </w:p>
+    <w:p>
+      <w:r>
+        <w:t>docker compose -f ..\..\Day_02\Lab_Files\docker-compose.yml down</w:t>
+      </w:r>
+    </w:p>
+    <w:p>
+      <w:r>
+        <w:t>docker compose up -d</w:t>
+      </w:r>
+    </w:p>
+    <w:p>
+      <w:r>
+        <w:t>docker compose ps</w:t>
+      </w:r>
+    </w:p>
+    <w:p>
+      <w:r>
+        <w:rPr>
+          <w:b/>
+        </w:rPr>
+        <w:t>macOS / Linux Bash</w:t>
+      </w:r>
+    </w:p>
+    <w:p>
+      <w:r>
+        <w:t>docker compose -f ../../Day_02/Lab_Files/docker-compose.yml down</w:t>
+      </w:r>
+    </w:p>
+    <w:p>
+      <w:r>
+        <w:t>docker compose up -d</w:t>
+      </w:r>
+    </w:p>
+    <w:p>
+      <w:r>
+        <w:t>docker compose ps</w:t>
+      </w:r>
+    </w:p>
+    <w:p>
+      <w:r>
+        <w:rPr>
+          <w:b/>
+        </w:rPr>
+        <w:t xml:space="preserve">Explanation: </w:t>
+      </w:r>
+      <w:r>
+        <w:t>Stopping Day 2 first avoids port conflicts on localhost:9092 and localhost:8080. The expected Day 3 containers are day3_broker1, day3_broker2, day3_broker3, day3_connect, and day3_kafka_ui.</w:t>
+      </w:r>
+    </w:p>
+    <w:p>
+      <w:r>
+        <w:rPr>
+          <w:b/>
+        </w:rPr>
+        <w:t xml:space="preserve">Mini-check: </w:t>
+      </w:r>
+      <w:r>
+        <w:t>Why does Day 3 need more ports than Day 2?</w:t>
+      </w:r>
+    </w:p>
+    <w:p>
+      <w:r>
+        <w:rPr>
+          <w:b/>
+        </w:rPr>
+        <w:t xml:space="preserve">Solution: </w:t>
+      </w:r>
+      <w:r>
+        <w:t>There are three exposed brokers plus Kafka Connect REST and Kafka UI.</w:t>
+      </w:r>
+    </w:p>
+    <w:p>
+      <w:r>
+        <w:rPr>
+          <w:b/>
+        </w:rPr>
+        <w:t xml:space="preserve">Evidence to capture: </w:t>
+      </w:r>
+      <w:r>
+        <w:t>`docker compose ps` showing all five Day 3 containers are Up.</w:t>
       </w:r>
     </w:p>
     <w:p>
       <w:pPr>
         <w:pStyle w:val="Heading1"/>
-        <w:jc w:val="left"/>
       </w:pPr>
       <w:r>
-        <w:t>9  Knowledge Check</w:t>
+        <w:t>Exercise 3: Open Kafka UI and Check Kafka Connect</w:t>
+      </w:r>
+    </w:p>
+    <w:p>
+      <w:r>
+        <w:rPr>
+          <w:b/>
+        </w:rPr>
+        <w:t xml:space="preserve">Goal: </w:t>
+      </w:r>
+      <w:r>
+        <w:t>Verify the visual UI and the Connect REST API.</w:t>
+      </w:r>
+    </w:p>
+    <w:p>
+      <w:r>
+        <w:rPr>
+          <w:b/>
+        </w:rPr>
+        <w:t xml:space="preserve">What you learn: </w:t>
+      </w:r>
+      <w:r>
+        <w:t>Day 2 already used Kafka UI for topics and messages. Day 3 also uses Kafka UI for brokers, consumer groups, and connector status.</w:t>
+      </w:r>
+    </w:p>
+    <w:p>
+      <w:r>
+        <w:rPr>
+          <w:b/>
+        </w:rPr>
+        <w:t>Windows Command Prompt</w:t>
+      </w:r>
+    </w:p>
+    <w:p>
+      <w:r>
+        <w:t>curl http://localhost:8083/</w:t>
+      </w:r>
+    </w:p>
+    <w:p>
+      <w:r>
+        <w:t>curl http://localhost:8083/connector-plugins</w:t>
+      </w:r>
+    </w:p>
+    <w:p>
+      <w:r>
+        <w:rPr>
+          <w:b/>
+        </w:rPr>
+        <w:t>macOS / Linux Bash</w:t>
+      </w:r>
+    </w:p>
+    <w:p>
+      <w:r>
+        <w:t>curl http://localhost:8083/</w:t>
+      </w:r>
+    </w:p>
+    <w:p>
+      <w:r>
+        <w:t>curl http://localhost:8083/connector-plugins</w:t>
+      </w:r>
+    </w:p>
+    <w:p>
+      <w:r>
+        <w:rPr>
+          <w:b/>
+        </w:rPr>
+        <w:t xml:space="preserve">Explanation: </w:t>
+      </w:r>
+      <w:r>
+        <w:t>Open http://localhost:8080 manually in a browser. The Connect root endpoint returns the Connect version. The connector-plugins endpoint should include FileStreamSourceConnector and FileStreamSinkConnector.</w:t>
+      </w:r>
+    </w:p>
+    <w:p>
+      <w:r>
+        <w:rPr>
+          <w:b/>
+        </w:rPr>
+        <w:t xml:space="preserve">Mini-check: </w:t>
+      </w:r>
+      <w:r>
+        <w:t>Which port is Kafka UI, and which port is Kafka Connect REST?</w:t>
+      </w:r>
+    </w:p>
+    <w:p>
+      <w:r>
+        <w:rPr>
+          <w:b/>
+        </w:rPr>
+        <w:t xml:space="preserve">Solution: </w:t>
+      </w:r>
+      <w:r>
+        <w:t>Kafka UI is http://localhost:8080. Kafka Connect REST is http://localhost:8083.</w:t>
+      </w:r>
+    </w:p>
+    <w:p>
+      <w:r>
+        <w:rPr>
+          <w:b/>
+        </w:rPr>
+        <w:t xml:space="preserve">Evidence to capture: </w:t>
+      </w:r>
+      <w:r>
+        <w:t>Connect REST output and a browser view of Kafka UI.</w:t>
       </w:r>
     </w:p>
     <w:p>
       <w:pPr>
-        <w:pStyle w:val="BodyText"/>
+        <w:pStyle w:val="Heading1"/>
       </w:pPr>
       <w:r>
+        <w:t>Exercise 4: Create Replicated Topics</w:t>
+      </w:r>
+    </w:p>
+    <w:p>
+      <w:r>
         <w:rPr>
-          <w:b w:val="0"/>
+          <w:b/>
         </w:rPr>
-        <w:t>Answer the following multiple‑choice questions to assess your understanding.  The answers are provided in the next section.</w:t>
+        <w:t xml:space="preserve">Goal: </w:t>
+      </w:r>
+      <w:r>
+        <w:t>Create topics that show partitions, leaders, replicas, and ISR.</w:t>
+      </w:r>
+    </w:p>
+    <w:p>
+      <w:r>
+        <w:rPr>
+          <w:b/>
+        </w:rPr>
+        <w:t xml:space="preserve">What you learn: </w:t>
+      </w:r>
+      <w:r>
+        <w:t>Day 2 already created a topic and described partitions. Day 3 adds replication factor, leaders, replicas, and in-sync replicas.</w:t>
+      </w:r>
+    </w:p>
+    <w:p>
+      <w:r>
+        <w:rPr>
+          <w:b/>
+        </w:rPr>
+        <w:t>Windows Command Prompt</w:t>
+      </w:r>
+    </w:p>
+    <w:p>
+      <w:r>
+        <w:t>docker compose exec broker1 kafka-topics --bootstrap-server broker1:29092,broker2:29092,broker3:29092 --create --if-not-exists --topic orders-replicated --partitions 3 --replication-factor 3 --config min.insync.replicas=2</w:t>
+      </w:r>
+    </w:p>
+    <w:p>
+      <w:r>
+        <w:t>docker compose exec broker1 kafka-topics --bootstrap-server broker1:29092,broker2:29092,broker3:29092 --describe --topic orders-replicated</w:t>
+      </w:r>
+    </w:p>
+    <w:p>
+      <w:r>
+        <w:t>docker compose exec broker1 kafka-topics --bootstrap-server broker1:29092,broker2:29092,broker3:29092 --create --if-not-exists --topic fs-source --partitions 1 --replication-factor 3 --config min.insync.replicas=2</w:t>
+      </w:r>
+    </w:p>
+    <w:p>
+      <w:r>
+        <w:rPr>
+          <w:b/>
+        </w:rPr>
+        <w:t>macOS / Linux Bash</w:t>
+      </w:r>
+    </w:p>
+    <w:p>
+      <w:r>
+        <w:t>docker compose exec broker1 kafka-topics --bootstrap-server broker1:29092,broker2:29092,broker3:29092 --create --if-not-exists --topic orders-replicated --partitions 3 --replication-factor 3 --config min.insync.replicas=2</w:t>
+      </w:r>
+    </w:p>
+    <w:p>
+      <w:r>
+        <w:t>docker compose exec broker1 kafka-topics --bootstrap-server broker1:29092,broker2:29092,broker3:29092 --describe --topic orders-replicated</w:t>
+      </w:r>
+    </w:p>
+    <w:p>
+      <w:r>
+        <w:t>docker compose exec broker1 kafka-topics --bootstrap-server broker1:29092,broker2:29092,broker3:29092 --create --if-not-exists --topic fs-source --partitions 1 --replication-factor 3 --config min.insync.replicas=2</w:t>
+      </w:r>
+    </w:p>
+    <w:p>
+      <w:r>
+        <w:rPr>
+          <w:b/>
+        </w:rPr>
+        <w:t xml:space="preserve">Explanation: </w:t>
+      </w:r>
+      <w:r>
+        <w:t>Replication factor 3 stores each partition on three brokers. `min.insync.replicas=2` means durable writes require at least two in-sync replicas when producers use `acks=all`.</w:t>
+      </w:r>
+    </w:p>
+    <w:p>
+      <w:r>
+        <w:rPr>
+          <w:b/>
+        </w:rPr>
+        <w:t xml:space="preserve">Mini-check: </w:t>
+      </w:r>
+      <w:r>
+        <w:t>What is the difference between Replicas and Isr in the describe output?</w:t>
+      </w:r>
+    </w:p>
+    <w:p>
+      <w:r>
+        <w:rPr>
+          <w:b/>
+        </w:rPr>
+        <w:t xml:space="preserve">Solution: </w:t>
+      </w:r>
+      <w:r>
+        <w:t>Replicas is the full placement list. Isr is the subset currently caught up and trusted.</w:t>
+      </w:r>
+    </w:p>
+    <w:p>
+      <w:r>
+        <w:rPr>
+          <w:b/>
+        </w:rPr>
+        <w:t xml:space="preserve">Evidence to capture: </w:t>
+      </w:r>
+      <w:r>
+        <w:t>Topic description showing PartitionCount, ReplicationFactor, Leader, Replicas, and Isr.</w:t>
       </w:r>
     </w:p>
     <w:p>
       <w:pPr>
-        <w:pStyle w:val="ListNumber"/>
+        <w:pStyle w:val="Heading1"/>
       </w:pPr>
       <w:r>
-        <w:t>Q1. Which internal Kafka topic stores committed offsets for consumer groups?</w:t>
+        <w:t>Exercise 5: Test Broker Failure, ISR, and KRaft Recovery</w:t>
+      </w:r>
+    </w:p>
+    <w:p>
+      <w:r>
+        <w:rPr>
+          <w:b/>
+        </w:rPr>
+        <w:t xml:space="preserve">Goal: </w:t>
+      </w:r>
+      <w:r>
+        <w:t>Prove that the replicated topic keeps enough in-sync replicas after one broker stops.</w:t>
+      </w:r>
+    </w:p>
+    <w:p>
+      <w:r>
+        <w:rPr>
+          <w:b/>
+        </w:rPr>
+        <w:t xml:space="preserve">What you learn: </w:t>
+      </w:r>
+      <w:r>
+        <w:t>Replication theory becomes real only when learners observe leader and ISR changes. KRaft metadata management is visible when the cluster continues after a broker restart.</w:t>
+      </w:r>
+    </w:p>
+    <w:p>
+      <w:r>
+        <w:rPr>
+          <w:b/>
+        </w:rPr>
+        <w:t>Windows Command Prompt</w:t>
+      </w:r>
+    </w:p>
+    <w:p>
+      <w:r>
+        <w:t>docker compose exec broker1 kafka-topics --bootstrap-server broker1:29092,broker2:29092,broker3:29092 --create --if-not-exists --topic ha-orders --partitions 3 --replication-factor 3 --config min.insync.replicas=2</w:t>
+      </w:r>
+    </w:p>
+    <w:p>
+      <w:r>
+        <w:t>docker compose exec broker1 kafka-topics --bootstrap-server broker1:29092,broker2:29092,broker3:29092 --describe --topic ha-orders</w:t>
+      </w:r>
+    </w:p>
+    <w:p>
+      <w:r>
+        <w:t>docker compose stop broker2</w:t>
+      </w:r>
+    </w:p>
+    <w:p>
+      <w:r>
+        <w:t>docker compose exec broker1 kafka-topics --bootstrap-server broker1:29092,broker3:29092 --describe --topic ha-orders</w:t>
+      </w:r>
+    </w:p>
+    <w:p>
+      <w:r>
+        <w:t>echo ha-after-broker-stop | docker compose exec -T broker1 kafka-console-producer --bootstrap-server broker1:29092,broker3:29092 --topic ha-orders --producer-property acks=all</w:t>
+      </w:r>
+    </w:p>
+    <w:p>
+      <w:r>
+        <w:t>docker compose start broker2</w:t>
+      </w:r>
+    </w:p>
+    <w:p>
+      <w:r>
+        <w:t>docker compose exec broker1 kafka-topics --bootstrap-server broker1:29092,broker2:29092,broker3:29092 --describe --topic ha-orders</w:t>
+      </w:r>
+    </w:p>
+    <w:p>
+      <w:r>
+        <w:rPr>
+          <w:b/>
+        </w:rPr>
+        <w:t>macOS / Linux Bash</w:t>
+      </w:r>
+    </w:p>
+    <w:p>
+      <w:r>
+        <w:t>docker compose exec broker1 kafka-topics --bootstrap-server broker1:29092,broker2:29092,broker3:29092 --create --if-not-exists --topic ha-orders --partitions 3 --replication-factor 3 --config min.insync.replicas=2</w:t>
+      </w:r>
+    </w:p>
+    <w:p>
+      <w:r>
+        <w:t>docker compose exec broker1 kafka-topics --bootstrap-server broker1:29092,broker2:29092,broker3:29092 --describe --topic ha-orders</w:t>
+      </w:r>
+    </w:p>
+    <w:p>
+      <w:r>
+        <w:t>docker compose stop broker2</w:t>
+      </w:r>
+    </w:p>
+    <w:p>
+      <w:r>
+        <w:t>docker compose exec broker1 kafka-topics --bootstrap-server broker1:29092,broker3:29092 --describe --topic ha-orders</w:t>
+      </w:r>
+    </w:p>
+    <w:p>
+      <w:r>
+        <w:t>echo ha-after-broker-stop | docker compose exec -T broker1 kafka-console-producer --bootstrap-server broker1:29092,broker3:29092 --topic ha-orders --producer-property acks=all</w:t>
+      </w:r>
+    </w:p>
+    <w:p>
+      <w:r>
+        <w:t>docker compose start broker2</w:t>
+      </w:r>
+    </w:p>
+    <w:p>
+      <w:r>
+        <w:t>docker compose exec broker1 kafka-topics --bootstrap-server broker1:29092,broker2:29092,broker3:29092 --describe --topic ha-orders</w:t>
+      </w:r>
+    </w:p>
+    <w:p>
+      <w:r>
+        <w:rPr>
+          <w:b/>
+        </w:rPr>
+        <w:t xml:space="preserve">Explanation: </w:t>
+      </w:r>
+      <w:r>
+        <w:t>After one broker stops, ISR should shrink but still contain enough replicas for `acks=all` writes. When the broker restarts, it should rejoin the ISR after catching up.</w:t>
+      </w:r>
+    </w:p>
+    <w:p>
+      <w:r>
+        <w:rPr>
+          <w:b/>
+        </w:rPr>
+        <w:t xml:space="preserve">Mini-check: </w:t>
+      </w:r>
+      <w:r>
+        <w:t>With RF=3 and min.insync.replicas=2, how many broker failures can this local lab usually tolerate for writes?</w:t>
+      </w:r>
+    </w:p>
+    <w:p>
+      <w:r>
+        <w:rPr>
+          <w:b/>
+        </w:rPr>
+        <w:t xml:space="preserve">Solution: </w:t>
+      </w:r>
+      <w:r>
+        <w:t>One broker failure. Two broker failures would leave fewer than two in-sync replicas.</w:t>
+      </w:r>
+    </w:p>
+    <w:p>
+      <w:r>
+        <w:rPr>
+          <w:b/>
+        </w:rPr>
+        <w:t xml:space="preserve">Evidence to capture: </w:t>
+      </w:r>
+      <w:r>
+        <w:t>Before/after topic descriptions, a successful `acks=all` produce while one broker is stopped, and final ISR recovery.</w:t>
+      </w:r>
+    </w:p>
+    <w:p>
+      <w:pPr>
+        <w:pStyle w:val="Heading1"/>
+      </w:pPr>
+      <w:r>
+        <w:t>Exercise 6: Run the Python Producer</w:t>
+      </w:r>
+    </w:p>
+    <w:p>
+      <w:r>
+        <w:rPr>
+          <w:b/>
+        </w:rPr>
+        <w:t xml:space="preserve">Goal: </w:t>
+      </w:r>
+      <w:r>
+        <w:t>Publish keyed JSON records with production-style producer settings.</w:t>
+      </w:r>
+    </w:p>
+    <w:p>
+      <w:r>
+        <w:rPr>
+          <w:b/>
+        </w:rPr>
+        <w:t xml:space="preserve">What you learn: </w:t>
+      </w:r>
+      <w:r>
+        <w:t>Day 2 already introduced Python producer serialization and delivery metadata. Day 3 focuses on idempotence, `acks=all`, compression, and key-based partition placement.</w:t>
+      </w:r>
+    </w:p>
+    <w:p>
+      <w:r>
+        <w:rPr>
+          <w:b/>
+        </w:rPr>
+        <w:t>Windows Command Prompt</w:t>
+      </w:r>
+    </w:p>
+    <w:p>
+      <w:r>
+        <w:t>python -m pip install -r requirements.txt</w:t>
+      </w:r>
+    </w:p>
+    <w:p>
+      <w:r>
+        <w:t>python producer.py --topic orders-replicated --bootstrap localhost:9092 --count 12 --prefix day3-lab</w:t>
+      </w:r>
+    </w:p>
+    <w:p>
+      <w:r>
+        <w:rPr>
+          <w:b/>
+        </w:rPr>
+        <w:t>macOS / Linux Bash</w:t>
+      </w:r>
+    </w:p>
+    <w:p>
+      <w:r>
+        <w:t>python3 -m pip install -r requirements.txt</w:t>
+      </w:r>
+    </w:p>
+    <w:p>
+      <w:r>
+        <w:t>python3 producer.py --topic orders-replicated --bootstrap localhost:9092 --count 12 --prefix day3-lab</w:t>
+      </w:r>
+    </w:p>
+    <w:p>
+      <w:r>
+        <w:rPr>
+          <w:b/>
+        </w:rPr>
+        <w:t xml:space="preserve">Explanation: </w:t>
+      </w:r>
+      <w:r>
+        <w:t>The producer prints `delivery=ok` after Kafka accepts each record. The output proves the topic, partition, offset, and key for each event.</w:t>
+      </w:r>
+    </w:p>
+    <w:p>
+      <w:r>
+        <w:rPr>
+          <w:b/>
+        </w:rPr>
+        <w:t xml:space="preserve">Mini-check: </w:t>
+      </w:r>
+      <w:r>
+        <w:t>Why are keyed records useful?</w:t>
+      </w:r>
+    </w:p>
+    <w:p>
+      <w:r>
+        <w:rPr>
+          <w:b/>
+        </w:rPr>
+        <w:t xml:space="preserve">Solution: </w:t>
+      </w:r>
+      <w:r>
+        <w:t>A key sends related records to the same partition, preserving per-key order.</w:t>
+      </w:r>
+    </w:p>
+    <w:p>
+      <w:r>
+        <w:rPr>
+          <w:b/>
+        </w:rPr>
+        <w:t xml:space="preserve">Evidence to capture: </w:t>
+      </w:r>
+      <w:r>
+        <w:t>Producer output with `delivery=ok`, partition, offset, and key.</w:t>
+      </w:r>
+    </w:p>
+    <w:p>
+      <w:pPr>
+        <w:pStyle w:val="Heading1"/>
+      </w:pPr>
+      <w:r>
+        <w:t>Exercise 7: Read Producer Guarantees and Exactly-Once Boundaries</w:t>
+      </w:r>
+    </w:p>
+    <w:p>
+      <w:r>
+        <w:rPr>
+          <w:b/>
+        </w:rPr>
+        <w:t xml:space="preserve">Goal: </w:t>
+      </w:r>
+      <w:r>
+        <w:t>Connect producer settings in the code to the delivery-semantics theory from the slides.</w:t>
+      </w:r>
+    </w:p>
+    <w:p>
+      <w:r>
+        <w:rPr>
+          <w:b/>
+        </w:rPr>
+        <w:t xml:space="preserve">What you learn: </w:t>
+      </w:r>
+      <w:r>
+        <w:t>Day 3 should not imply that `acks=all` alone means exactly-once processing. Learners should separate Kafka retry safety from downstream side-effect safety.</w:t>
+      </w:r>
+    </w:p>
+    <w:p>
+      <w:r>
+        <w:rPr>
+          <w:b/>
+        </w:rPr>
+        <w:t>Windows Command Prompt</w:t>
+      </w:r>
+    </w:p>
+    <w:p>
+      <w:r>
+        <w:t>type producer.py</w:t>
+      </w:r>
+    </w:p>
+    <w:p>
+      <w:r>
+        <w:t>python producer.py --topic orders-replicated --bootstrap localhost:9092 --count 4 --prefix guarantee-demo</w:t>
+      </w:r>
+    </w:p>
+    <w:p>
+      <w:r>
+        <w:rPr>
+          <w:b/>
+        </w:rPr>
+        <w:t>macOS / Linux Bash</w:t>
+      </w:r>
+    </w:p>
+    <w:p>
+      <w:r>
+        <w:t>cat producer.py</w:t>
+      </w:r>
+    </w:p>
+    <w:p>
+      <w:r>
+        <w:t>python3 producer.py --topic orders-replicated --bootstrap localhost:9092 --count 4 --prefix guarantee-demo</w:t>
+      </w:r>
+    </w:p>
+    <w:p>
+      <w:r>
+        <w:rPr>
+          <w:b/>
+        </w:rPr>
+        <w:t xml:space="preserve">Explanation: </w:t>
+      </w:r>
+      <w:r>
+        <w:t>`acks=all` asks Kafka to wait for required in-sync replicas. `enable.idempotence=true` protects against duplicate producer writes caused by retries. Exactly-once for a full application also depends on transactional writes or idempotent downstream processing.</w:t>
+      </w:r>
+    </w:p>
+    <w:p>
+      <w:r>
+        <w:rPr>
+          <w:b/>
+        </w:rPr>
+        <w:t xml:space="preserve">Mini-check: </w:t>
+      </w:r>
+      <w:r>
+        <w:t>Which setting prevents producer retry duplicates?</w:t>
+      </w:r>
+    </w:p>
+    <w:p>
+      <w:r>
+        <w:rPr>
+          <w:b/>
+        </w:rPr>
+        <w:t xml:space="preserve">Solution: </w:t>
+      </w:r>
+      <w:r>
+        <w:t>`enable.idempotence=true` prevents duplicate writes from producer retries.</w:t>
+      </w:r>
+    </w:p>
+    <w:p>
+      <w:r>
+        <w:rPr>
+          <w:b/>
+        </w:rPr>
+        <w:t xml:space="preserve">Evidence to capture: </w:t>
+      </w:r>
+      <w:r>
+        <w:t>A short note identifying `acks=all`, `enable.idempotence`, `compression.type`, key selection and delivery output.</w:t>
+      </w:r>
+    </w:p>
+    <w:p>
+      <w:pPr>
+        <w:pStyle w:val="Heading1"/>
+      </w:pPr>
+      <w:r>
+        <w:t>Exercise 8: Run the Manual-Commit Consumer</w:t>
+      </w:r>
+    </w:p>
+    <w:p>
+      <w:r>
+        <w:rPr>
+          <w:b/>
+        </w:rPr>
+        <w:t xml:space="preserve">Goal: </w:t>
+      </w:r>
+      <w:r>
+        <w:t>Consume records and commit offsets only after processing.</w:t>
+      </w:r>
+    </w:p>
+    <w:p>
+      <w:r>
+        <w:rPr>
+          <w:b/>
+        </w:rPr>
+        <w:t xml:space="preserve">What you learn: </w:t>
+      </w:r>
+      <w:r>
+        <w:t>Day 2 already introduced basic consumer deserialization. Day 3 focuses on consumer groups, manual commits, and lag.</w:t>
+      </w:r>
+    </w:p>
+    <w:p>
+      <w:r>
+        <w:rPr>
+          <w:b/>
+        </w:rPr>
+        <w:t>Windows Command Prompt</w:t>
+      </w:r>
+    </w:p>
+    <w:p>
+      <w:r>
+        <w:t>python consumer.py --topic orders-replicated --bootstrap localhost:9092 --group cg-day3-python --max-messages 12 --reset earliest</w:t>
+      </w:r>
+    </w:p>
+    <w:p>
+      <w:r>
+        <w:t>docker compose exec broker1 kafka-consumer-groups --bootstrap-server broker1:29092,broker2:29092,broker3:29092 --describe --group cg-day3-python</w:t>
+      </w:r>
+    </w:p>
+    <w:p>
+      <w:r>
+        <w:rPr>
+          <w:b/>
+        </w:rPr>
+        <w:t>macOS / Linux Bash</w:t>
+      </w:r>
+    </w:p>
+    <w:p>
+      <w:r>
+        <w:t>python3 consumer.py --topic orders-replicated --bootstrap localhost:9092 --group cg-day3-python --max-messages 12 --reset earliest</w:t>
+      </w:r>
+    </w:p>
+    <w:p>
+      <w:r>
+        <w:t>docker compose exec broker1 kafka-consumer-groups --bootstrap-server broker1:29092,broker2:29092,broker3:29092 --describe --group cg-day3-python</w:t>
+      </w:r>
+    </w:p>
+    <w:p>
+      <w:r>
+        <w:rPr>
+          <w:b/>
+        </w:rPr>
+        <w:t xml:space="preserve">Explanation: </w:t>
+      </w:r>
+      <w:r>
+        <w:t>The consumer prints each record and then commits its offset. The group description shows whether the group has caught up to the topic end.</w:t>
+      </w:r>
+    </w:p>
+    <w:p>
+      <w:r>
+        <w:rPr>
+          <w:b/>
+        </w:rPr>
+        <w:t xml:space="preserve">Mini-check: </w:t>
+      </w:r>
+      <w:r>
+        <w:t>What does LAG 0 mean?</w:t>
+      </w:r>
+    </w:p>
+    <w:p>
+      <w:r>
+        <w:rPr>
+          <w:b/>
+        </w:rPr>
+        <w:t xml:space="preserve">Solution: </w:t>
+      </w:r>
+      <w:r>
+        <w:t>The group committed offset has reached the current log end offset for its assigned partitions.</w:t>
+      </w:r>
+    </w:p>
+    <w:p>
+      <w:r>
+        <w:rPr>
+          <w:b/>
+        </w:rPr>
+        <w:t xml:space="preserve">Evidence to capture: </w:t>
+      </w:r>
+      <w:r>
+        <w:t>Consumer output with `commit=ok` and group description showing LAG 0.</w:t>
+      </w:r>
+    </w:p>
+    <w:p>
+      <w:pPr>
+        <w:pStyle w:val="Heading1"/>
+      </w:pPr>
+      <w:r>
+        <w:t>Exercise 9: Prove Independent Consumer Groups</w:t>
+      </w:r>
+    </w:p>
+    <w:p>
+      <w:r>
+        <w:rPr>
+          <w:b/>
+        </w:rPr>
+        <w:t xml:space="preserve">Goal: </w:t>
+      </w:r>
+      <w:r>
+        <w:t>Show that different applications can read the same topic independently.</w:t>
+      </w:r>
+    </w:p>
+    <w:p>
+      <w:r>
+        <w:rPr>
+          <w:b/>
+        </w:rPr>
+        <w:t xml:space="preserve">What you learn: </w:t>
+      </w:r>
+      <w:r>
+        <w:t>Day 2 showed one consumer reading a topic. Day 3 shows that each consumer group keeps separate offsets.</w:t>
+      </w:r>
+    </w:p>
+    <w:p>
+      <w:r>
+        <w:rPr>
+          <w:b/>
+        </w:rPr>
+        <w:t>Windows Command Prompt</w:t>
+      </w:r>
+    </w:p>
+    <w:p>
+      <w:r>
+        <w:t>docker compose exec broker1 kafka-console-consumer --bootstrap-server broker1:29092,broker2:29092,broker3:29092 --topic orders-replicated --group cg-audit --from-beginning --timeout-ms 15000 --property print.partition=true --property print.offset=true</w:t>
+      </w:r>
+    </w:p>
+    <w:p>
+      <w:r>
+        <w:t>docker compose exec broker1 kafka-console-consumer --bootstrap-server broker1:29092,broker2:29092,broker3:29092 --topic orders-replicated --group cg-audit --from-beginning --timeout-ms 15000</w:t>
+      </w:r>
+    </w:p>
+    <w:p>
+      <w:r>
+        <w:rPr>
+          <w:b/>
+        </w:rPr>
+        <w:t>macOS / Linux Bash</w:t>
+      </w:r>
+    </w:p>
+    <w:p>
+      <w:r>
+        <w:t>docker compose exec broker1 kafka-console-consumer --bootstrap-server broker1:29092,broker2:29092,broker3:29092 --topic orders-replicated --group cg-audit --from-beginning --timeout-ms 15000 --property print.partition=true --property print.offset=true</w:t>
+      </w:r>
+    </w:p>
+    <w:p>
+      <w:r>
+        <w:t>docker compose exec broker1 kafka-console-consumer --bootstrap-server broker1:29092,broker2:29092,broker3:29092 --topic orders-replicated --group cg-audit --from-beginning --timeout-ms 15000</w:t>
+      </w:r>
+    </w:p>
+    <w:p>
+      <w:r>
+        <w:rPr>
+          <w:b/>
+        </w:rPr>
+        <w:t xml:space="preserve">Explanation: </w:t>
+      </w:r>
+      <w:r>
+        <w:t>The first run reads because `cg-audit` has no committed offsets yet. The second run should not reread the same records unless new records arrived or the group offset was reset.</w:t>
+      </w:r>
+    </w:p>
+    <w:p>
+      <w:r>
+        <w:rPr>
+          <w:b/>
+        </w:rPr>
+        <w:t xml:space="preserve">Mini-check: </w:t>
+      </w:r>
+      <w:r>
+        <w:t>Why does `cg-audit` not share progress with `cg-day3-python`?</w:t>
+      </w:r>
+    </w:p>
+    <w:p>
+      <w:r>
+        <w:rPr>
+          <w:b/>
+        </w:rPr>
+        <w:t xml:space="preserve">Solution: </w:t>
+      </w:r>
+      <w:r>
+        <w:t>Offsets are stored per group, so each application has its own progress bookmark.</w:t>
+      </w:r>
+    </w:p>
+    <w:p>
+      <w:r>
+        <w:rPr>
+          <w:b/>
+        </w:rPr>
+        <w:t xml:space="preserve">Evidence to capture: </w:t>
+      </w:r>
+      <w:r>
+        <w:t>Terminal output from both `cg-audit` runs and Kafka UI Consumer Groups view.</w:t>
+      </w:r>
+    </w:p>
+    <w:p>
+      <w:pPr>
+        <w:pStyle w:val="Heading1"/>
+      </w:pPr>
+      <w:r>
+        <w:t>Exercise 10: Observe Partition Assignment and Rebalance</w:t>
+      </w:r>
+    </w:p>
+    <w:p>
+      <w:r>
+        <w:rPr>
+          <w:b/>
+        </w:rPr>
+        <w:t xml:space="preserve">Goal: </w:t>
+      </w:r>
+      <w:r>
+        <w:t>See consumer group membership and partition ownership change when consumers join or leave.</w:t>
+      </w:r>
+    </w:p>
+    <w:p>
+      <w:r>
+        <w:rPr>
+          <w:b/>
+        </w:rPr>
+        <w:t xml:space="preserve">What you learn: </w:t>
+      </w:r>
+      <w:r>
+        <w:t>Rebalancing is a core Day 3 theory topic. The lab evidence is group membership, assignment movement and temporary lag changes.</w:t>
+      </w:r>
+    </w:p>
+    <w:p>
+      <w:r>
+        <w:rPr>
+          <w:b/>
+        </w:rPr>
+        <w:t>Windows Command Prompt</w:t>
+      </w:r>
+    </w:p>
+    <w:p>
+      <w:r>
+        <w:t>docker compose exec broker1 kafka-console-consumer --bootstrap-server broker1:29092,broker2:29092,broker3:29092 --topic orders-replicated --group cg-live --from-beginning --property print.partition=true --property print.offset=true</w:t>
+      </w:r>
+    </w:p>
+    <w:p>
+      <w:r>
+        <w:t>docker compose exec broker1 kafka-consumer-groups --bootstrap-server broker1:29092,broker2:29092,broker3:29092 --describe --group cg-live</w:t>
+      </w:r>
+    </w:p>
+    <w:p>
+      <w:r>
+        <w:rPr>
+          <w:b/>
+        </w:rPr>
+        <w:t>macOS / Linux Bash</w:t>
+      </w:r>
+    </w:p>
+    <w:p>
+      <w:r>
+        <w:t>docker compose exec broker1 kafka-console-consumer --bootstrap-server broker1:29092,broker2:29092,broker3:29092 --topic orders-replicated --group cg-live --from-beginning --property print.partition=true --property print.offset=true</w:t>
+      </w:r>
+    </w:p>
+    <w:p>
+      <w:r>
+        <w:t>docker compose exec broker1 kafka-consumer-groups --bootstrap-server broker1:29092,broker2:29092,broker3:29092 --describe --group cg-live</w:t>
+      </w:r>
+    </w:p>
+    <w:p>
+      <w:r>
+        <w:rPr>
+          <w:b/>
+        </w:rPr>
+        <w:t xml:space="preserve">Explanation: </w:t>
+      </w:r>
+      <w:r>
+        <w:t>Run the consumer command in two separate terminals with the same group id. Stop one consumer with Ctrl+C and describe the group again. Kafka moves partition ownership among the remaining active members.</w:t>
+      </w:r>
+    </w:p>
+    <w:p>
+      <w:r>
+        <w:rPr>
+          <w:b/>
+        </w:rPr>
+        <w:t xml:space="preserve">Mini-check: </w:t>
+      </w:r>
+      <w:r>
+        <w:t>Why can adding a consumer cause a short processing pause?</w:t>
+      </w:r>
+    </w:p>
+    <w:p>
+      <w:r>
+        <w:rPr>
+          <w:b/>
+        </w:rPr>
+        <w:t xml:space="preserve">Solution: </w:t>
+      </w:r>
+      <w:r>
+        <w:t>The group must rebalance partition ownership before all members resume normal processing.</w:t>
+      </w:r>
+    </w:p>
+    <w:p>
+      <w:r>
+        <w:rPr>
+          <w:b/>
+        </w:rPr>
+        <w:t xml:space="preserve">Evidence to capture: </w:t>
+      </w:r>
+      <w:r>
+        <w:t>Consumer group description before and after a second consumer joins or leaves.</w:t>
+      </w:r>
+    </w:p>
+    <w:p>
+      <w:pPr>
+        <w:pStyle w:val="Heading1"/>
+      </w:pPr>
+      <w:r>
+        <w:t>Exercise 11: Inspect Lag and Reset Offsets</w:t>
+      </w:r>
+    </w:p>
+    <w:p>
+      <w:r>
+        <w:rPr>
+          <w:b/>
+        </w:rPr>
+        <w:t xml:space="preserve">Goal: </w:t>
+      </w:r>
+      <w:r>
+        <w:t>Inspect group lag and perform a controlled replay.</w:t>
+      </w:r>
+    </w:p>
+    <w:p>
+      <w:r>
+        <w:rPr>
+          <w:b/>
+        </w:rPr>
+        <w:t xml:space="preserve">What you learn: </w:t>
+      </w:r>
+      <w:r>
+        <w:t>Day 2 used `--from-beginning` for simple replay. Day 3 uses committed offsets and explicit group offset reset.</w:t>
+      </w:r>
+    </w:p>
+    <w:p>
+      <w:r>
+        <w:rPr>
+          <w:b/>
+        </w:rPr>
+        <w:t>Windows Command Prompt</w:t>
+      </w:r>
+    </w:p>
+    <w:p>
+      <w:r>
+        <w:t>docker compose exec broker1 kafka-consumer-groups --bootstrap-server broker1:29092,broker2:29092,broker3:29092 --describe --group cg-day3-python</w:t>
+      </w:r>
+    </w:p>
+    <w:p>
+      <w:r>
+        <w:t>docker compose exec broker1 kafka-consumer-groups --bootstrap-server broker1:29092,broker2:29092,broker3:29092 --group cg-day3-python --topic orders-replicated --reset-offsets --to-earliest --dry-run</w:t>
+      </w:r>
+    </w:p>
+    <w:p>
+      <w:r>
+        <w:t>docker compose exec broker1 kafka-consumer-groups --bootstrap-server broker1:29092,broker2:29092,broker3:29092 --group cg-day3-python --topic orders-replicated --reset-offsets --to-earliest --execute</w:t>
+      </w:r>
+    </w:p>
+    <w:p>
+      <w:r>
+        <w:rPr>
+          <w:b/>
+        </w:rPr>
+        <w:t>macOS / Linux Bash</w:t>
+      </w:r>
+    </w:p>
+    <w:p>
+      <w:r>
+        <w:t>docker compose exec broker1 kafka-consumer-groups --bootstrap-server broker1:29092,broker2:29092,broker3:29092 --describe --group cg-day3-python</w:t>
+      </w:r>
+    </w:p>
+    <w:p>
+      <w:r>
+        <w:t>docker compose exec broker1 kafka-consumer-groups --bootstrap-server broker1:29092,broker2:29092,broker3:29092 --group cg-day3-python --topic orders-replicated --reset-offsets --to-earliest --dry-run</w:t>
+      </w:r>
+    </w:p>
+    <w:p>
+      <w:r>
+        <w:t>docker compose exec broker1 kafka-consumer-groups --bootstrap-server broker1:29092,broker2:29092,broker3:29092 --group cg-day3-python --topic orders-replicated --reset-offsets --to-earliest --execute</w:t>
+      </w:r>
+    </w:p>
+    <w:p>
+      <w:r>
+        <w:rPr>
+          <w:b/>
+        </w:rPr>
+        <w:t xml:space="preserve">Explanation: </w:t>
+      </w:r>
+      <w:r>
+        <w:t>Use `--dry-run` first to see the planned offset change. Use `--execute` only when you intentionally want replay.</w:t>
+      </w:r>
+    </w:p>
+    <w:p>
+      <w:r>
+        <w:rPr>
+          <w:b/>
+        </w:rPr>
+        <w:t xml:space="preserve">Mini-check: </w:t>
+      </w:r>
+      <w:r>
+        <w:t>Why can replay be risky?</w:t>
+      </w:r>
+    </w:p>
+    <w:p>
+      <w:r>
+        <w:rPr>
+          <w:b/>
+        </w:rPr>
+        <w:t xml:space="preserve">Solution: </w:t>
+      </w:r>
+      <w:r>
+        <w:t>Replay can repeat downstream side effects unless the downstream process is idempotent.</w:t>
+      </w:r>
+    </w:p>
+    <w:p>
+      <w:r>
+        <w:rPr>
+          <w:b/>
+        </w:rPr>
+        <w:t xml:space="preserve">Evidence to capture: </w:t>
+      </w:r>
+      <w:r>
+        <w:t>Dry-run and execute output showing the offset reset plan and result.</w:t>
+      </w:r>
+    </w:p>
+    <w:p>
+      <w:pPr>
+        <w:pStyle w:val="Heading1"/>
+      </w:pPr>
+      <w:r>
+        <w:t>Exercise 12: Run the FileStream Source Connector</w:t>
+      </w:r>
+    </w:p>
+    <w:p>
+      <w:r>
+        <w:rPr>
+          <w:b/>
+        </w:rPr>
+        <w:t xml:space="preserve">Goal: </w:t>
+      </w:r>
+      <w:r>
+        <w:t>Move lines from a local file into Kafka using Kafka Connect.</w:t>
+      </w:r>
+    </w:p>
+    <w:p>
+      <w:r>
+        <w:rPr>
+          <w:b/>
+        </w:rPr>
+        <w:t xml:space="preserve">What you learn: </w:t>
+      </w:r>
+      <w:r>
+        <w:t>Day 2 produced records directly into Kafka. Day 3 uses Kafka Connect to move external data into Kafka.</w:t>
+      </w:r>
+    </w:p>
+    <w:p>
+      <w:r>
+        <w:rPr>
+          <w:b/>
+        </w:rPr>
+        <w:t>Windows Command Prompt</w:t>
+      </w:r>
+    </w:p>
+    <w:p>
+      <w:r>
+        <w:t>curl -X DELETE http://localhost:8083/connectors/fs-source-connector</w:t>
+      </w:r>
+    </w:p>
+    <w:p>
+      <w:r>
+        <w:t>curl -X POST -H "Content-Type: application/json" --data @connector-source.json http://localhost:8083/connectors</w:t>
+      </w:r>
+    </w:p>
+    <w:p>
+      <w:r>
+        <w:t>curl http://localhost:8083/connectors/fs-source-connector/status</w:t>
+      </w:r>
+    </w:p>
+    <w:p>
+      <w:r>
+        <w:t>docker compose exec broker1 kafka-console-consumer --bootstrap-server broker1:29092,broker2:29092,broker3:29092 --topic fs-source --from-beginning --timeout-ms 15000 --max-messages 3</w:t>
+      </w:r>
+    </w:p>
+    <w:p>
+      <w:r>
+        <w:rPr>
+          <w:b/>
+        </w:rPr>
+        <w:t>macOS / Linux Bash</w:t>
+      </w:r>
+    </w:p>
+    <w:p>
+      <w:r>
+        <w:t>curl -X DELETE http://localhost:8083/connectors/fs-source-connector</w:t>
+      </w:r>
+    </w:p>
+    <w:p>
+      <w:r>
+        <w:t>curl -X POST -H "Content-Type: application/json" --data @connector-source.json http://localhost:8083/connectors</w:t>
+      </w:r>
+    </w:p>
+    <w:p>
+      <w:r>
+        <w:t>curl http://localhost:8083/connectors/fs-source-connector/status</w:t>
+      </w:r>
+    </w:p>
+    <w:p>
+      <w:r>
+        <w:t>docker compose exec broker1 kafka-console-consumer --bootstrap-server broker1:29092,broker2:29092,broker3:29092 --topic fs-source --from-beginning --timeout-ms 15000 --max-messages 3</w:t>
+      </w:r>
+    </w:p>
+    <w:p>
+      <w:r>
+        <w:rPr>
+          <w:b/>
+        </w:rPr>
+        <w:t xml:space="preserve">Explanation: </w:t>
+      </w:r>
+      <w:r>
+        <w:t>If the DELETE command returns 404, that only means the connector did not exist yet. The source connector reads `/data/input/produce.txt` inside the Connect container and writes records to `fs-source`.</w:t>
+      </w:r>
+    </w:p>
+    <w:p>
+      <w:r>
+        <w:rPr>
+          <w:b/>
+        </w:rPr>
+        <w:t xml:space="preserve">Mini-check: </w:t>
+      </w:r>
+      <w:r>
+        <w:t>What direction does a source connector move data?</w:t>
+      </w:r>
+    </w:p>
+    <w:p>
+      <w:r>
+        <w:rPr>
+          <w:b/>
+        </w:rPr>
+        <w:t xml:space="preserve">Solution: </w:t>
+      </w:r>
+      <w:r>
+        <w:t>A source connector moves data from an external system into Kafka.</w:t>
+      </w:r>
+    </w:p>
+    <w:p>
+      <w:r>
+        <w:rPr>
+          <w:b/>
+        </w:rPr>
+        <w:t xml:space="preserve">Evidence to capture: </w:t>
+      </w:r>
+      <w:r>
+        <w:t>Connector RUNNING status and three records consumed from `fs-source`.</w:t>
+      </w:r>
+    </w:p>
+    <w:p>
+      <w:pPr>
+        <w:pStyle w:val="Heading1"/>
+      </w:pPr>
+      <w:r>
+        <w:t>Exercise 13: Run the FileStream Sink Connector</w:t>
+      </w:r>
+    </w:p>
+    <w:p>
+      <w:r>
+        <w:rPr>
+          <w:b/>
+        </w:rPr>
+        <w:t xml:space="preserve">Goal: </w:t>
+      </w:r>
+      <w:r>
+        <w:t>Move Kafka records from `fs-source` into a local output file.</w:t>
+      </w:r>
+    </w:p>
+    <w:p>
+      <w:r>
+        <w:rPr>
+          <w:b/>
+        </w:rPr>
+        <w:t xml:space="preserve">What you learn: </w:t>
+      </w:r>
+      <w:r>
+        <w:t>Day 2 consumed records with a Python application. Day 3 also demonstrates a managed sink connector as another consumer of Kafka records.</w:t>
+      </w:r>
+    </w:p>
+    <w:p>
+      <w:r>
+        <w:rPr>
+          <w:b/>
+        </w:rPr>
+        <w:t>Windows Command Prompt</w:t>
+      </w:r>
+    </w:p>
+    <w:p>
+      <w:r>
+        <w:t>curl -X DELETE http://localhost:8083/connectors/fs-sink-connector</w:t>
+      </w:r>
+    </w:p>
+    <w:p>
+      <w:r>
+        <w:t>curl -X POST -H "Content-Type: application/json" --data @connector-sink.json http://localhost:8083/connectors</w:t>
+      </w:r>
+    </w:p>
+    <w:p>
+      <w:r>
+        <w:t>curl http://localhost:8083/connectors/fs-sink-connector/status</w:t>
+      </w:r>
+    </w:p>
+    <w:p>
+      <w:r>
+        <w:t>type data\output\consume.txt</w:t>
+      </w:r>
+    </w:p>
+    <w:p>
+      <w:r>
+        <w:rPr>
+          <w:b/>
+        </w:rPr>
+        <w:t>macOS / Linux Bash</w:t>
+      </w:r>
+    </w:p>
+    <w:p>
+      <w:r>
+        <w:t>curl -X DELETE http://localhost:8083/connectors/fs-sink-connector</w:t>
+      </w:r>
+    </w:p>
+    <w:p>
+      <w:r>
+        <w:t>curl -X POST -H "Content-Type: application/json" --data @connector-sink.json http://localhost:8083/connectors</w:t>
+      </w:r>
+    </w:p>
+    <w:p>
+      <w:r>
+        <w:t>curl http://localhost:8083/connectors/fs-sink-connector/status</w:t>
+      </w:r>
+    </w:p>
+    <w:p>
+      <w:r>
+        <w:t>cat data/output/consume.txt</w:t>
+      </w:r>
+    </w:p>
+    <w:p>
+      <w:r>
+        <w:rPr>
+          <w:b/>
+        </w:rPr>
+        <w:t xml:space="preserve">Explanation: </w:t>
+      </w:r>
+      <w:r>
+        <w:t>If the DELETE command returns 404, that only means the connector did not exist yet. The sink connector reads Kafka topic `fs-source` and writes `/data/output/consume.txt` inside the Connect container.</w:t>
+      </w:r>
+    </w:p>
+    <w:p>
+      <w:r>
+        <w:rPr>
+          <w:b/>
+        </w:rPr>
+        <w:t xml:space="preserve">Mini-check: </w:t>
+      </w:r>
+      <w:r>
+        <w:t>Why check both connector status and output file contents?</w:t>
+      </w:r>
+    </w:p>
+    <w:p>
+      <w:r>
+        <w:rPr>
+          <w:b/>
+        </w:rPr>
+        <w:t xml:space="preserve">Solution: </w:t>
+      </w:r>
+      <w:r>
+        <w:t>RUNNING proves the task is alive. The output file proves the end-to-end data path works.</w:t>
+      </w:r>
+    </w:p>
+    <w:p>
+      <w:r>
+        <w:rPr>
+          <w:b/>
+        </w:rPr>
+        <w:t xml:space="preserve">Evidence to capture: </w:t>
+      </w:r>
+      <w:r>
+        <w:t>Connector RUNNING status and `consume.txt` containing the same lines as the input file.</w:t>
+      </w:r>
+    </w:p>
+    <w:p>
+      <w:pPr>
+        <w:pStyle w:val="Heading1"/>
+      </w:pPr>
+      <w:r>
+        <w:t>Exercise 14: Restart Connect and Troubleshoot Connector State</w:t>
+      </w:r>
+    </w:p>
+    <w:p>
+      <w:r>
+        <w:rPr>
+          <w:b/>
+        </w:rPr>
+        <w:t xml:space="preserve">Goal: </w:t>
+      </w:r>
+      <w:r>
+        <w:t>Prove that connector configuration and offsets survive a worker restart.</w:t>
+      </w:r>
+    </w:p>
+    <w:p>
+      <w:r>
+        <w:rPr>
+          <w:b/>
+        </w:rPr>
+        <w:t xml:space="preserve">What you learn: </w:t>
+      </w:r>
+      <w:r>
+        <w:t>Connect theory includes workers, tasks, internal topics and recovery. This exercise checks status and the actual data path after a restart.</w:t>
+      </w:r>
+    </w:p>
+    <w:p>
+      <w:r>
+        <w:rPr>
+          <w:b/>
+        </w:rPr>
+        <w:t>Windows Command Prompt</w:t>
+      </w:r>
+    </w:p>
+    <w:p>
+      <w:r>
+        <w:t>docker compose restart connect</w:t>
+      </w:r>
+    </w:p>
+    <w:p>
+      <w:r>
+        <w:t>curl http://localhost:8083/connectors/fs-source-connector/status</w:t>
+      </w:r>
+    </w:p>
+    <w:p>
+      <w:r>
+        <w:t>curl http://localhost:8083/connectors/fs-sink-connector/status</w:t>
+      </w:r>
+    </w:p>
+    <w:p>
+      <w:r>
+        <w:t>docker compose exec -T connect bash -lc "echo order-004^|customer=C107^|amount=32.50^|status=shipped &gt;&gt; /data/input/produce.txt"</w:t>
+      </w:r>
+    </w:p>
+    <w:p>
+      <w:r>
+        <w:t>type data\output\consume.txt</w:t>
+      </w:r>
+    </w:p>
+    <w:p>
+      <w:r>
+        <w:rPr>
+          <w:b/>
+        </w:rPr>
+        <w:t>macOS / Linux Bash</w:t>
+      </w:r>
+    </w:p>
+    <w:p>
+      <w:r>
+        <w:t>docker compose restart connect</w:t>
+      </w:r>
+    </w:p>
+    <w:p>
+      <w:r>
+        <w:t>curl http://localhost:8083/connectors/fs-source-connector/status</w:t>
+      </w:r>
+    </w:p>
+    <w:p>
+      <w:r>
+        <w:t>curl http://localhost:8083/connectors/fs-sink-connector/status</w:t>
+      </w:r>
+    </w:p>
+    <w:p>
+      <w:r>
+        <w:t>docker compose exec -T connect bash -lc 'echo "order-004|customer=C107|amount=32.50|status=shipped" &gt;&gt; /data/input/produce.txt'</w:t>
+      </w:r>
+    </w:p>
+    <w:p>
+      <w:r>
+        <w:t>cat data/output/consume.txt</w:t>
+      </w:r>
+    </w:p>
+    <w:p>
+      <w:r>
+        <w:rPr>
+          <w:b/>
+        </w:rPr>
+        <w:t xml:space="preserve">Explanation: </w:t>
+      </w:r>
+      <w:r>
+        <w:t>The status endpoints show whether the connector and task are RUNNING. The output file proves recovery at the data-path level.</w:t>
+      </w:r>
+    </w:p>
+    <w:p>
+      <w:r>
+        <w:rPr>
+          <w:b/>
+        </w:rPr>
+        <w:t xml:space="preserve">Mini-check: </w:t>
+      </w:r>
+      <w:r>
+        <w:t>What remembers source progress in distributed Connect mode?</w:t>
+      </w:r>
+    </w:p>
+    <w:p>
+      <w:r>
+        <w:rPr>
+          <w:b/>
+        </w:rPr>
+        <w:t xml:space="preserve">Solution: </w:t>
+      </w:r>
+      <w:r>
+        <w:t>The Connect offset storage topic stores source connector progress.</w:t>
+      </w:r>
+    </w:p>
+    <w:p>
+      <w:r>
+        <w:rPr>
+          <w:b/>
+        </w:rPr>
+        <w:t xml:space="preserve">Evidence to capture: </w:t>
+      </w:r>
+      <w:r>
+        <w:t>Connector statuses after restart and one new output line in `consume.txt`.</w:t>
+      </w:r>
+    </w:p>
+    <w:p>
+      <w:pPr>
+        <w:pStyle w:val="Heading1"/>
+      </w:pPr>
+      <w:r>
+        <w:t>Exercise 15: Choose the Right Kafka Ecosystem Tool</w:t>
+      </w:r>
+    </w:p>
+    <w:p>
+      <w:r>
+        <w:rPr>
+          <w:b/>
+        </w:rPr>
+        <w:t xml:space="preserve">Goal: </w:t>
+      </w:r>
+      <w:r>
+        <w:t>Connect the final ecosystem theory slides to practical tool selection.</w:t>
+      </w:r>
+    </w:p>
+    <w:p>
+      <w:r>
+        <w:rPr>
+          <w:b/>
+        </w:rPr>
+        <w:t xml:space="preserve">What you learn: </w:t>
+      </w:r>
+      <w:r>
+        <w:t>The final Day 3 theory section introduces tools learners will meet later. This exercise prevents tool names from becoming memorized labels without use cases.</w:t>
+      </w:r>
+    </w:p>
+    <w:p>
+      <w:r>
+        <w:rPr>
+          <w:b/>
+        </w:rPr>
+        <w:t>Windows Command Prompt</w:t>
+      </w:r>
+    </w:p>
+    <w:p>
+      <w:r>
+        <w:t>echo Use Kafka Connect for managed source/sink integration.</w:t>
+      </w:r>
+    </w:p>
+    <w:p>
+      <w:r>
+        <w:t>echo Use Kafka Streams for Java stream processing applications.</w:t>
+      </w:r>
+    </w:p>
+    <w:p>
+      <w:r>
+        <w:t>echo Use ksqlDB for SQL-style streaming queries.</w:t>
+      </w:r>
+    </w:p>
+    <w:p>
+      <w:r>
+        <w:t>echo Use Schema Registry for schema compatibility.</w:t>
+      </w:r>
+    </w:p>
+    <w:p>
+      <w:r>
+        <w:t>echo Use MirrorMaker 2 for cluster-to-cluster replication.</w:t>
+      </w:r>
+    </w:p>
+    <w:p>
+      <w:r>
+        <w:rPr>
+          <w:b/>
+        </w:rPr>
+        <w:t>macOS / Linux Bash</w:t>
+      </w:r>
+    </w:p>
+    <w:p>
+      <w:r>
+        <w:t>echo 'Use Kafka Connect for managed source/sink integration.'</w:t>
+      </w:r>
+    </w:p>
+    <w:p>
+      <w:r>
+        <w:t>echo 'Use Kafka Streams for Java stream processing applications.'</w:t>
+      </w:r>
+    </w:p>
+    <w:p>
+      <w:r>
+        <w:t>echo 'Use ksqlDB for SQL-style streaming queries.'</w:t>
+      </w:r>
+    </w:p>
+    <w:p>
+      <w:r>
+        <w:t>echo 'Use Schema Registry for schema compatibility.'</w:t>
+      </w:r>
+    </w:p>
+    <w:p>
+      <w:r>
+        <w:t>echo 'Use MirrorMaker 2 for cluster-to-cluster replication.'</w:t>
+      </w:r>
+    </w:p>
+    <w:p>
+      <w:r>
+        <w:rPr>
+          <w:b/>
+        </w:rPr>
+        <w:t xml:space="preserve">Explanation: </w:t>
+      </w:r>
+      <w:r>
+        <w:t>This is a knowledge-check exercise, not a service startup exercise. Learners should explain why each tool fits its use case.</w:t>
+      </w:r>
+    </w:p>
+    <w:p>
+      <w:r>
+        <w:rPr>
+          <w:b/>
+        </w:rPr>
+        <w:t xml:space="preserve">Mini-check: </w:t>
+      </w:r>
+      <w:r>
+        <w:t>Which tool is used in this lab to move file data into and out of Kafka?</w:t>
+      </w:r>
+    </w:p>
+    <w:p>
+      <w:r>
+        <w:rPr>
+          <w:b/>
+        </w:rPr>
+        <w:t xml:space="preserve">Solution: </w:t>
+      </w:r>
+      <w:r>
+        <w:t>Kafka Connect, through FileStream source and sink connectors.</w:t>
+      </w:r>
+    </w:p>
+    <w:p>
+      <w:r>
+        <w:rPr>
+          <w:b/>
+        </w:rPr>
+        <w:t xml:space="preserve">Evidence to capture: </w:t>
+      </w:r>
+      <w:r>
+        <w:t>A short written mapping of tool name to use case.</w:t>
+      </w:r>
+    </w:p>
+    <w:p>
+      <w:pPr>
+        <w:pStyle w:val="Heading1"/>
+      </w:pPr>
+      <w:r>
+        <w:t>Kafka UI Evidence Checklist</w:t>
       </w:r>
     </w:p>
     <w:p>
@@ -524,7 +2093,7 @@
         <w:pStyle w:val="ListBullet"/>
       </w:pPr>
       <w:r>
-        <w:t>a) __consumer_offsets</w:t>
+        <w:t>Topics: `orders-replicated` and `fs-source` exist.</w:t>
       </w:r>
     </w:p>
     <w:p>
@@ -532,7 +2101,7 @@
         <w:pStyle w:val="ListBullet"/>
       </w:pPr>
       <w:r>
-        <w:t>b) __transaction_state</w:t>
+        <w:t>Messages: order events show keys, partitions, offsets, and values.</w:t>
       </w:r>
     </w:p>
     <w:p>
@@ -540,7 +2109,7 @@
         <w:pStyle w:val="ListBullet"/>
       </w:pPr>
       <w:r>
-        <w:t>c) __connect_offsets</w:t>
+        <w:t>Consumer Groups: `cg-day3-python` and `cg-audit` show separate offsets.</w:t>
       </w:r>
     </w:p>
     <w:p>
@@ -548,15 +2117,7 @@
         <w:pStyle w:val="ListBullet"/>
       </w:pPr>
       <w:r>
-        <w:t>d) __cluster_metadata</w:t>
-      </w:r>
-    </w:p>
-    <w:p>
-      <w:pPr>
-        <w:pStyle w:val="ListNumber"/>
-      </w:pPr>
-      <w:r>
-        <w:t>Q2. What does the cooperative sticky assignment strategy aim to achieve?</w:t>
+        <w:t>Brokers: the replicated topic shows three replicas and full ISR in a healthy state.</w:t>
       </w:r>
     </w:p>
     <w:p>
@@ -564,311 +2125,52 @@
         <w:pStyle w:val="ListBullet"/>
       </w:pPr>
       <w:r>
-        <w:t>a) Balance partition sizes strictly by key</w:t>
-      </w:r>
-    </w:p>
-    <w:p>
-      <w:pPr>
-        <w:pStyle w:val="ListBullet"/>
-      </w:pPr>
-      <w:r>
-        <w:t>b) Minimise partition movement during rebalances</w:t>
-      </w:r>
-    </w:p>
-    <w:p>
-      <w:pPr>
-        <w:pStyle w:val="ListBullet"/>
-      </w:pPr>
-      <w:r>
-        <w:t>c) Distribute partitions round‑robin</w:t>
-      </w:r>
-    </w:p>
-    <w:p>
-      <w:pPr>
-        <w:pStyle w:val="ListBullet"/>
-      </w:pPr>
-      <w:r>
-        <w:t>d) Randomly assign partitions</w:t>
-      </w:r>
-    </w:p>
-    <w:p>
-      <w:pPr>
-        <w:pStyle w:val="ListNumber"/>
-      </w:pPr>
-      <w:r>
-        <w:t>Q3. When does Kafka elect a new leader for a partition?</w:t>
-      </w:r>
-    </w:p>
-    <w:p>
-      <w:pPr>
-        <w:pStyle w:val="ListBullet"/>
-      </w:pPr>
-      <w:r>
-        <w:t>a) When a replica falls out of the ISR</w:t>
-      </w:r>
-    </w:p>
-    <w:p>
-      <w:pPr>
-        <w:pStyle w:val="ListBullet"/>
-      </w:pPr>
-      <w:r>
-        <w:t>b) When the current leader broker fails</w:t>
-      </w:r>
-    </w:p>
-    <w:p>
-      <w:pPr>
-        <w:pStyle w:val="ListBullet"/>
-      </w:pPr>
-      <w:r>
-        <w:t>c) At fixed intervals</w:t>
-      </w:r>
-    </w:p>
-    <w:p>
-      <w:pPr>
-        <w:pStyle w:val="ListBullet"/>
-      </w:pPr>
-      <w:r>
-        <w:t>d) When producers request it</w:t>
-      </w:r>
-    </w:p>
-    <w:p>
-      <w:pPr>
-        <w:pStyle w:val="ListNumber"/>
-      </w:pPr>
-      <w:r>
-        <w:t>Q4. Which ingestion pattern offers low‑latency change data capture from a database?</w:t>
-      </w:r>
-    </w:p>
-    <w:p>
-      <w:pPr>
-        <w:pStyle w:val="ListBullet"/>
-      </w:pPr>
-      <w:r>
-        <w:t>a) Query‑based polling</w:t>
-      </w:r>
-    </w:p>
-    <w:p>
-      <w:pPr>
-        <w:pStyle w:val="ListBullet"/>
-      </w:pPr>
-      <w:r>
-        <w:t>b) CDC using WAL/binlog</w:t>
-      </w:r>
-    </w:p>
-    <w:p>
-      <w:pPr>
-        <w:pStyle w:val="ListBullet"/>
-      </w:pPr>
-      <w:r>
-        <w:t>c) API polling</w:t>
-      </w:r>
-    </w:p>
-    <w:p>
-      <w:pPr>
-        <w:pStyle w:val="ListBullet"/>
-      </w:pPr>
-      <w:r>
-        <w:t>d) File tailing</w:t>
-      </w:r>
-    </w:p>
-    <w:p>
-      <w:pPr>
-        <w:pStyle w:val="ListNumber"/>
-      </w:pPr>
-      <w:r>
-        <w:t>Q5. Which tool should you use to manage and validate schemas for Avro, Protobuf and JSON?</w:t>
-      </w:r>
-    </w:p>
-    <w:p>
-      <w:pPr>
-        <w:pStyle w:val="ListBullet"/>
-      </w:pPr>
-      <w:r>
-        <w:t>a) Kafka Streams</w:t>
-      </w:r>
-    </w:p>
-    <w:p>
-      <w:pPr>
-        <w:pStyle w:val="ListBullet"/>
-      </w:pPr>
-      <w:r>
-        <w:t>b) Schema Registry</w:t>
-      </w:r>
-    </w:p>
-    <w:p>
-      <w:pPr>
-        <w:pStyle w:val="ListBullet"/>
-      </w:pPr>
-      <w:r>
-        <w:t>c) MirrorMaker</w:t>
-      </w:r>
-    </w:p>
-    <w:p>
-      <w:pPr>
-        <w:pStyle w:val="ListBullet"/>
-      </w:pPr>
-      <w:r>
-        <w:t>d) KsqlDB</w:t>
-      </w:r>
-    </w:p>
-    <w:p>
-      <w:pPr>
-        <w:pStyle w:val="ListNumber"/>
-      </w:pPr>
-      <w:r>
-        <w:t>Q6. What happens if `min.insync.replicas` is set to 2 on a topic with replication factor 3 and two brokers fail?</w:t>
-      </w:r>
-    </w:p>
-    <w:p>
-      <w:pPr>
-        <w:pStyle w:val="ListBullet"/>
-      </w:pPr>
-      <w:r>
-        <w:t>a) Producers can still write data</w:t>
-      </w:r>
-    </w:p>
-    <w:p>
-      <w:pPr>
-        <w:pStyle w:val="ListBullet"/>
-      </w:pPr>
-      <w:r>
-        <w:t>b) Only reads are possible</w:t>
-      </w:r>
-    </w:p>
-    <w:p>
-      <w:pPr>
-        <w:pStyle w:val="ListBullet"/>
-      </w:pPr>
-      <w:r>
-        <w:t>c) Produces will receive an exception</w:t>
-      </w:r>
-    </w:p>
-    <w:p>
-      <w:pPr>
-        <w:pStyle w:val="ListBullet"/>
-      </w:pPr>
-      <w:r>
-        <w:t>d) The leader moves to a follower</w:t>
+        <w:t>Kafka Connect: `fs-source-connector` and `fs-sink-connector` are RUNNING.</w:t>
       </w:r>
     </w:p>
     <w:p>
       <w:pPr>
         <w:pStyle w:val="Heading1"/>
-        <w:jc w:val="left"/>
       </w:pPr>
       <w:r>
-        <w:t>10  Reflection &amp; Brainstorming</w:t>
-      </w:r>
-    </w:p>
-    <w:p>
-      <w:pPr>
-        <w:pStyle w:val="BodyText"/>
-      </w:pPr>
+        <w:t>Cleanup</w:t>
+      </w:r>
+    </w:p>
+    <w:p>
       <w:r>
         <w:rPr>
           <w:b/>
         </w:rPr>
-        <w:t>Discuss the following prompts with your peers or write down your thoughts:</w:t>
-      </w:r>
-    </w:p>
-    <w:p>
-      <w:pPr>
-        <w:pStyle w:val="ListBullet"/>
-      </w:pPr>
-      <w:r>
-        <w:t>Design a partitioning strategy for a topic storing customer orders.  What key would you choose and why?</w:t>
-      </w:r>
-    </w:p>
-    <w:p>
-      <w:pPr>
-        <w:pStyle w:val="ListBullet"/>
-      </w:pPr>
-      <w:r>
-        <w:t>In which scenarios would you enable static group membership using `group.instance.id`?</w:t>
-      </w:r>
-    </w:p>
-    <w:p>
-      <w:pPr>
-        <w:pStyle w:val="ListBullet"/>
-      </w:pPr>
-      <w:r>
-        <w:t>How might you structure a Connect pipeline to copy data from a transactional database to a data lake with exactly‑once semantics?</w:t>
-      </w:r>
-    </w:p>
-    <w:p>
-      <w:pPr>
-        <w:pStyle w:val="ListBullet"/>
-      </w:pPr>
-      <w:r>
-        <w:t>Which combination of Kafka ecosystem tools would you use to build a real‑time ETL pipeline from database to dashboard?</w:t>
-      </w:r>
-    </w:p>
-    <w:p>
-      <w:pPr>
-        <w:pStyle w:val="Heading1"/>
-        <w:jc w:val="left"/>
-      </w:pPr>
-      <w:r>
-        <w:t>11  Answer Key</w:t>
-      </w:r>
-    </w:p>
-    <w:p>
-      <w:pPr>
-        <w:pStyle w:val="BodyText"/>
-      </w:pPr>
+        <w:t>Windows Command Prompt</w:t>
+      </w:r>
+    </w:p>
+    <w:p>
+      <w:r>
+        <w:t>docker compose down</w:t>
+      </w:r>
+    </w:p>
+    <w:p>
       <w:r>
         <w:rPr>
-          <w:b w:val="0"/>
+          <w:b/>
         </w:rPr>
-        <w:t>Below are the correct answers for the multiple‑choice questions:</w:t>
-      </w:r>
-    </w:p>
-    <w:p>
-      <w:pPr>
-        <w:pStyle w:val="ListBullet"/>
-      </w:pPr>
-      <w:r>
-        <w:t>Q1: a) __consumer_offsets</w:t>
-      </w:r>
-    </w:p>
-    <w:p>
-      <w:pPr>
-        <w:pStyle w:val="ListBullet"/>
-      </w:pPr>
-      <w:r>
-        <w:t>Q2: b) Minimise partition movement during rebalances</w:t>
-      </w:r>
-    </w:p>
-    <w:p>
-      <w:pPr>
-        <w:pStyle w:val="ListBullet"/>
-      </w:pPr>
-      <w:r>
-        <w:t>Q3: b) When the current leader broker fails</w:t>
-      </w:r>
-    </w:p>
-    <w:p>
-      <w:pPr>
-        <w:pStyle w:val="ListBullet"/>
-      </w:pPr>
-      <w:r>
-        <w:t>Q4: b) CDC using WAL/binlog</w:t>
-      </w:r>
-    </w:p>
-    <w:p>
-      <w:pPr>
-        <w:pStyle w:val="ListBullet"/>
-      </w:pPr>
-      <w:r>
-        <w:t>Q5: b) Schema Registry</w:t>
-      </w:r>
-    </w:p>
-    <w:p>
-      <w:pPr>
-        <w:pStyle w:val="ListBullet"/>
-      </w:pPr>
-      <w:r>
-        <w:t>Q6: c) Produces will receive an exception (not enough in‑sync replicas)</w:t>
+        <w:t>macOS / Linux Bash</w:t>
+      </w:r>
+    </w:p>
+    <w:p>
+      <w:r>
+        <w:t>docker compose down</w:t>
+      </w:r>
+    </w:p>
+    <w:p>
+      <w:r>
+        <w:rPr>
+          <w:b/>
+        </w:rPr>
+        <w:t xml:space="preserve">Explanation: </w:t>
+      </w:r>
+      <w:r>
+        <w:t>Use `docker compose down -v` only when you intentionally want to delete Kafka topic data and connector offsets.</w:t>
       </w:r>
     </w:p>
     <w:sectPr>
@@ -1244,6 +2546,10 @@
     <w:name w:val="Normal"/>
     <w:qFormat/>
     <w:rsid w:val="00FC693F"/>
+    <w:rPr>
+      <w:rFonts w:ascii="Calibri" w:hAnsi="Calibri"/>
+      <w:sz w:val="20"/>
+    </w:rPr>
   </w:style>
   <w:style w:type="paragraph" w:styleId="Header">
     <w:name w:val="header"/>
@@ -1304,10 +2610,9 @@
       <w:outlineLvl w:val="0"/>
     </w:pPr>
     <w:rPr>
-      <w:rFonts w:asciiTheme="majorHAnsi" w:eastAsiaTheme="majorEastAsia" w:hAnsiTheme="majorHAnsi" w:cstheme="majorBidi"/>
       <w:b/>
       <w:bCs/>
-      <w:color w:val="365F91" w:themeColor="accent1" w:themeShade="BF"/>
+      <w:color w:val="365F91"/>
       <w:sz w:val="28"/>
       <w:szCs w:val="28"/>
     </w:rPr>
@@ -1328,10 +2633,9 @@
       <w:outlineLvl w:val="1"/>
     </w:pPr>
     <w:rPr>
-      <w:rFonts w:asciiTheme="majorHAnsi" w:eastAsiaTheme="majorEastAsia" w:hAnsiTheme="majorHAnsi" w:cstheme="majorBidi"/>
       <w:b/>
       <w:bCs/>
-      <w:color w:val="4F81BD" w:themeColor="accent1"/>
+      <w:color w:val="4F81BD"/>
       <w:sz w:val="26"/>
       <w:szCs w:val="26"/>
     </w:rPr>
@@ -1352,10 +2656,9 @@
       <w:outlineLvl w:val="2"/>
     </w:pPr>
     <w:rPr>
-      <w:rFonts w:asciiTheme="majorHAnsi" w:eastAsiaTheme="majorEastAsia" w:hAnsiTheme="majorHAnsi" w:cstheme="majorBidi"/>
       <w:b/>
       <w:bCs/>
-      <w:color w:val="4F81BD" w:themeColor="accent1"/>
+      <w:color w:val="4F81BD"/>
     </w:rPr>
   </w:style>
   <w:style w:type="paragraph" w:styleId="Heading4">

</xml_diff>